<commit_message>
fixed 165 test scripts, edited software doc, added hardware images
</commit_message>
<xml_diff>
--- a/docs/editable/Python Technical Documentation.docx
+++ b/docs/editable/Python Technical Documentation.docx
@@ -247,7 +247,7 @@
           <w:noProof/>
         </w:rPr>
         <w:drawing>
-          <wp:inline distT="0" distB="0" distL="0" distR="0" wp14:anchorId="71AF074F" wp14:editId="51E23463">
+          <wp:inline distT="0" distB="0" distL="0" distR="0" wp14:anchorId="71AF074F" wp14:editId="4818DE4C">
             <wp:extent cx="4529138" cy="4234950"/>
             <wp:effectExtent l="0" t="0" r="5080" b="0"/>
             <wp:docPr id="600801524" name="Picture 2"/>
@@ -1612,7 +1612,7 @@
           <w:noProof/>
         </w:rPr>
         <w:drawing>
-          <wp:inline distT="0" distB="0" distL="0" distR="0" wp14:anchorId="7711B43E" wp14:editId="3603FBDE">
+          <wp:inline distT="0" distB="0" distL="0" distR="0" wp14:anchorId="7711B43E" wp14:editId="28CC7E5F">
             <wp:extent cx="5929630" cy="3181350"/>
             <wp:effectExtent l="0" t="0" r="0" b="0"/>
             <wp:docPr id="1310520674" name="Picture 3"/>
@@ -4222,10 +4222,10 @@
         </w:rPr>
         <w:lastRenderedPageBreak/>
         <w:drawing>
-          <wp:inline distT="0" distB="0" distL="0" distR="0" wp14:anchorId="2C0F0EB0" wp14:editId="58B3321B">
-            <wp:extent cx="3498193" cy="4143375"/>
-            <wp:effectExtent l="0" t="0" r="7620" b="0"/>
-            <wp:docPr id="1662443379" name="Picture 6"/>
+          <wp:inline distT="0" distB="0" distL="0" distR="0" wp14:anchorId="0F476EFE" wp14:editId="2137A841">
+            <wp:extent cx="3589786" cy="4395788"/>
+            <wp:effectExtent l="0" t="0" r="0" b="5080"/>
+            <wp:docPr id="1147879699" name="Picture 3"/>
             <wp:cNvGraphicFramePr>
               <a:graphicFrameLocks xmlns:a="http://schemas.openxmlformats.org/drawingml/2006/main" noChangeAspect="1"/>
             </wp:cNvGraphicFramePr>
@@ -4233,13 +4233,13 @@
               <a:graphicData uri="http://schemas.openxmlformats.org/drawingml/2006/picture">
                 <pic:pic xmlns:pic="http://schemas.openxmlformats.org/drawingml/2006/picture">
                   <pic:nvPicPr>
-                    <pic:cNvPr id="0" name="Picture 6"/>
+                    <pic:cNvPr id="0" name="Picture 3"/>
                     <pic:cNvPicPr>
                       <a:picLocks noChangeAspect="1" noChangeArrowheads="1"/>
                     </pic:cNvPicPr>
                   </pic:nvPicPr>
                   <pic:blipFill>
-                    <a:blip r:embed="rId14">
+                    <a:blip r:embed="rId14" cstate="print">
                       <a:extLst>
                         <a:ext uri="{28A0092B-C50C-407E-A947-70E740481C1C}">
                           <a14:useLocalDpi xmlns:a14="http://schemas.microsoft.com/office/drawing/2010/main" val="0"/>
@@ -4254,7 +4254,7 @@
                   <pic:spPr bwMode="auto">
                     <a:xfrm>
                       <a:off x="0" y="0"/>
-                      <a:ext cx="3503482" cy="4149639"/>
+                      <a:ext cx="3609285" cy="4419665"/>
                     </a:xfrm>
                     <a:prstGeom prst="rect">
                       <a:avLst/>
@@ -4445,14 +4445,6 @@
         <w:spacing w:line="276" w:lineRule="auto"/>
         <w:rPr>
           <w:rFonts w:ascii="Times New Roman" w:hAnsi="Times New Roman" w:cs="Times New Roman"/>
-        </w:rPr>
-      </w:pPr>
-    </w:p>
-    <w:p>
-      <w:pPr>
-        <w:spacing w:line="276" w:lineRule="auto"/>
-        <w:rPr>
-          <w:rFonts w:ascii="Times New Roman" w:hAnsi="Times New Roman" w:cs="Times New Roman"/>
           <w:b/>
           <w:bCs/>
           <w:sz w:val="32"/>
@@ -4509,13 +4501,17 @@
       <w:r>
         <w:rPr>
           <w:rFonts w:ascii="Times New Roman" w:hAnsi="Times New Roman" w:cs="Times New Roman"/>
+          <w:b/>
+          <w:bCs/>
           <w:noProof/>
+          <w:sz w:val="28"/>
+          <w:szCs w:val="28"/>
         </w:rPr>
         <w:drawing>
-          <wp:inline distT="0" distB="0" distL="0" distR="0" wp14:anchorId="432E5852" wp14:editId="1DB7FA24">
-            <wp:extent cx="5939155" cy="4358005"/>
+          <wp:inline distT="0" distB="0" distL="0" distR="0" wp14:anchorId="269239B7" wp14:editId="5DFF2B94">
+            <wp:extent cx="5939155" cy="4681855"/>
             <wp:effectExtent l="0" t="0" r="4445" b="4445"/>
-            <wp:docPr id="26103144" name="Picture 2"/>
+            <wp:docPr id="1270986687" name="Picture 2"/>
             <wp:cNvGraphicFramePr>
               <a:graphicFrameLocks xmlns:a="http://schemas.openxmlformats.org/drawingml/2006/main" noChangeAspect="1"/>
             </wp:cNvGraphicFramePr>
@@ -4544,7 +4540,7 @@
                   <pic:spPr bwMode="auto">
                     <a:xfrm>
                       <a:off x="0" y="0"/>
-                      <a:ext cx="5939155" cy="4358005"/>
+                      <a:ext cx="5939155" cy="4681855"/>
                     </a:xfrm>
                     <a:prstGeom prst="rect">
                       <a:avLst/>
@@ -4750,6 +4746,7 @@
         <w:rPr>
           <w:rFonts w:ascii="Times New Roman" w:hAnsi="Times New Roman" w:cs="Times New Roman"/>
         </w:rPr>
+        <w:lastRenderedPageBreak/>
         <w:t>QTextEdit</w:t>
       </w:r>
       <w:proofErr w:type="spellEnd"/>
@@ -4757,14 +4754,7 @@
         <w:rPr>
           <w:rFonts w:ascii="Times New Roman" w:hAnsi="Times New Roman" w:cs="Times New Roman"/>
         </w:rPr>
-        <w:t xml:space="preserve"> widget at the bottom displays updates throughout the program, mainly serial </w:t>
-      </w:r>
-      <w:r>
-        <w:rPr>
-          <w:rFonts w:ascii="Times New Roman" w:hAnsi="Times New Roman" w:cs="Times New Roman"/>
-        </w:rPr>
-        <w:lastRenderedPageBreak/>
-        <w:t>communication with the hardware to inform users of any errors the program encounters and update the status on test script execution. This also acts as a log for the program.</w:t>
+        <w:t xml:space="preserve"> widget at the bottom displays updates throughout the program, mainly serial communication with the hardware to inform users of any errors the program encounters and update the status on test script execution. This also acts as a log for the program.</w:t>
       </w:r>
     </w:p>
     <w:p>
@@ -4813,6 +4803,82 @@
           <w:rFonts w:ascii="Times New Roman" w:hAnsi="Times New Roman" w:cs="Times New Roman"/>
         </w:rPr>
         <w:t xml:space="preserve"> and be implemented in the directory device/, or in serial_communcation.py itself.</w:t>
+      </w:r>
+      <w:r>
+        <w:rPr>
+          <w:rFonts w:ascii="Times New Roman" w:hAnsi="Times New Roman" w:cs="Times New Roman"/>
+        </w:rPr>
+        <w:t xml:space="preserve"> </w:t>
+      </w:r>
+      <w:proofErr w:type="spellStart"/>
+      <w:r>
+        <w:rPr>
+          <w:rFonts w:ascii="Times New Roman" w:hAnsi="Times New Roman" w:cs="Times New Roman"/>
+        </w:rPr>
+        <w:t>SerialCommunication</w:t>
+      </w:r>
+      <w:proofErr w:type="spellEnd"/>
+      <w:r>
+        <w:rPr>
+          <w:rFonts w:ascii="Times New Roman" w:hAnsi="Times New Roman" w:cs="Times New Roman"/>
+        </w:rPr>
+        <w:t xml:space="preserve"> must be assigned to the field </w:t>
+      </w:r>
+      <w:proofErr w:type="spellStart"/>
+      <w:r>
+        <w:rPr>
+          <w:rFonts w:ascii="Times New Roman" w:hAnsi="Times New Roman" w:cs="Times New Roman"/>
+        </w:rPr>
+        <w:t>serial_handler</w:t>
+      </w:r>
+      <w:proofErr w:type="spellEnd"/>
+      <w:r>
+        <w:rPr>
+          <w:rFonts w:ascii="Times New Roman" w:hAnsi="Times New Roman" w:cs="Times New Roman"/>
+        </w:rPr>
+        <w:t xml:space="preserve"> and connect both the done and error signals to _</w:t>
+      </w:r>
+      <w:proofErr w:type="spellStart"/>
+      <w:r>
+        <w:rPr>
+          <w:rFonts w:ascii="Times New Roman" w:hAnsi="Times New Roman" w:cs="Times New Roman"/>
+        </w:rPr>
+        <w:t>cleanup_serial_handler</w:t>
+      </w:r>
+      <w:proofErr w:type="spellEnd"/>
+      <w:r>
+        <w:rPr>
+          <w:rFonts w:ascii="Times New Roman" w:hAnsi="Times New Roman" w:cs="Times New Roman"/>
+        </w:rPr>
+        <w:t xml:space="preserve">. This ensures only one object will use serial communication and the </w:t>
+      </w:r>
+      <w:proofErr w:type="spellStart"/>
+      <w:r>
+        <w:rPr>
+          <w:rFonts w:ascii="Times New Roman" w:hAnsi="Times New Roman" w:cs="Times New Roman"/>
+        </w:rPr>
+        <w:t>readyRead</w:t>
+      </w:r>
+      <w:proofErr w:type="spellEnd"/>
+      <w:r>
+        <w:rPr>
+          <w:rFonts w:ascii="Times New Roman" w:hAnsi="Times New Roman" w:cs="Times New Roman"/>
+        </w:rPr>
+        <w:t xml:space="preserve"> signal is not connected to multiple </w:t>
+      </w:r>
+      <w:proofErr w:type="spellStart"/>
+      <w:r>
+        <w:rPr>
+          <w:rFonts w:ascii="Times New Roman" w:hAnsi="Times New Roman" w:cs="Times New Roman"/>
+        </w:rPr>
+        <w:t>SerialCommunication</w:t>
+      </w:r>
+      <w:proofErr w:type="spellEnd"/>
+      <w:r>
+        <w:rPr>
+          <w:rFonts w:ascii="Times New Roman" w:hAnsi="Times New Roman" w:cs="Times New Roman"/>
+        </w:rPr>
+        <w:t xml:space="preserve"> objects.</w:t>
       </w:r>
     </w:p>
     <w:p>
@@ -5170,6 +5236,7 @@
         <w:rPr>
           <w:rFonts w:ascii="Times New Roman" w:hAnsi="Times New Roman" w:cs="Times New Roman"/>
         </w:rPr>
+        <w:lastRenderedPageBreak/>
         <w:t xml:space="preserve">Every page of the widget derives from the </w:t>
       </w:r>
       <w:proofErr w:type="spellStart"/>
@@ -5212,14 +5279,7 @@
         <w:rPr>
           <w:rFonts w:ascii="Times New Roman" w:hAnsi="Times New Roman" w:cs="Times New Roman"/>
         </w:rPr>
-        <w:t xml:space="preserve">; if false, it will prevent the user from moving onto the next page. The function will extract the data from the entries the user provided </w:t>
-      </w:r>
-      <w:r>
-        <w:rPr>
-          <w:rFonts w:ascii="Times New Roman" w:hAnsi="Times New Roman" w:cs="Times New Roman"/>
-        </w:rPr>
-        <w:lastRenderedPageBreak/>
-        <w:t xml:space="preserve">into the expected structure that the parsing algorithm expects. The page’s respective “parse” function is called for validation. The order of the pages is the same order as the parsing algorithm’s order. To share information between the pages, as some parsing functions are dependent on other portions, </w:t>
+        <w:t xml:space="preserve">; if false, it will prevent the user from moving onto the next page. The function will extract the data from the entries the user provided into the expected structure that the parsing algorithm expects. The page’s respective “parse” function is called for validation. The order of the pages is the same order as the parsing algorithm’s order. To share information between the pages, as some parsing functions are dependent on other portions, </w:t>
       </w:r>
       <w:proofErr w:type="spellStart"/>
       <w:r>
@@ -5534,6 +5594,12 @@
         </w:rPr>
         <w:t xml:space="preserve"> library. It is highly recommended to run these unit tests after making changes to test scripts or source code to ensure everything works as expected.</w:t>
       </w:r>
+      <w:r>
+        <w:rPr>
+          <w:rFonts w:ascii="Times New Roman" w:hAnsi="Times New Roman" w:cs="Times New Roman"/>
+        </w:rPr>
+        <w:t xml:space="preserve"> All unit tests must begin with “test.”</w:t>
+      </w:r>
     </w:p>
     <w:p>
       <w:pPr>
@@ -5627,54 +5693,6 @@
           <w:rFonts w:ascii="Times New Roman" w:hAnsi="Times New Roman" w:cs="Times New Roman"/>
         </w:rPr>
         <w:t>.” The first decorator creates a reusable test fixture that all tests in the file can use. Each test will have a unique copy of the test fixture, avoiding any issues where data may be modified in between tests. The second decorator allows the parametrization of test functions, meaning the same function can be used with different inputs. This reduces the amount of code written to do similar tests with only minor changes to the inputs, such as edge cases.</w:t>
-      </w:r>
-    </w:p>
-    <w:p>
-      <w:pPr>
-        <w:spacing w:line="276" w:lineRule="auto"/>
-        <w:rPr>
-          <w:rFonts w:ascii="Times New Roman" w:hAnsi="Times New Roman" w:cs="Times New Roman"/>
-        </w:rPr>
-      </w:pPr>
-      <w:r>
-        <w:rPr>
-          <w:rFonts w:ascii="Times New Roman" w:hAnsi="Times New Roman" w:cs="Times New Roman"/>
-        </w:rPr>
-        <w:t xml:space="preserve">Note: </w:t>
-      </w:r>
-      <w:proofErr w:type="spellStart"/>
-      <w:r>
-        <w:rPr>
-          <w:rFonts w:ascii="Times New Roman" w:hAnsi="Times New Roman" w:cs="Times New Roman"/>
-        </w:rPr>
-        <w:t>PyTest</w:t>
-      </w:r>
-      <w:proofErr w:type="spellEnd"/>
-      <w:r>
-        <w:rPr>
-          <w:rFonts w:ascii="Times New Roman" w:hAnsi="Times New Roman" w:cs="Times New Roman"/>
-        </w:rPr>
-        <w:t xml:space="preserve"> will automatically find test functions and test classes, but they must start with “test” and “Test” respectively. Without t</w:t>
-      </w:r>
-      <w:r>
-        <w:rPr>
-          <w:rFonts w:ascii="Times New Roman" w:hAnsi="Times New Roman" w:cs="Times New Roman"/>
-        </w:rPr>
-        <w:t xml:space="preserve">hose keywords, </w:t>
-      </w:r>
-      <w:proofErr w:type="spellStart"/>
-      <w:r>
-        <w:rPr>
-          <w:rFonts w:ascii="Times New Roman" w:hAnsi="Times New Roman" w:cs="Times New Roman"/>
-        </w:rPr>
-        <w:t>PyTest</w:t>
-      </w:r>
-      <w:proofErr w:type="spellEnd"/>
-      <w:r>
-        <w:rPr>
-          <w:rFonts w:ascii="Times New Roman" w:hAnsi="Times New Roman" w:cs="Times New Roman"/>
-        </w:rPr>
-        <w:t xml:space="preserve"> will assume it is not a test and skip it.</w:t>
       </w:r>
     </w:p>
     <w:p>
@@ -7865,14 +7883,6 @@
 </file>
 
 <file path=customXml/item1.xml><?xml version="1.0" encoding="utf-8"?>
-<p:properties xmlns:p="http://schemas.microsoft.com/office/2006/metadata/properties" xmlns:xsi="http://www.w3.org/2001/XMLSchema-instance" xmlns:pc="http://schemas.microsoft.com/office/infopath/2007/PartnerControls">
-  <documentManagement>
-    <_activity xmlns="90d77c43-296a-4b3f-9e49-e5a41fa612db" xsi:nil="true"/>
-  </documentManagement>
-</p:properties>
-</file>
-
-<file path=customXml/item2.xml><?xml version="1.0" encoding="utf-8"?>
 <ct:contentTypeSchema xmlns:ct="http://schemas.microsoft.com/office/2006/metadata/contentType" xmlns:ma="http://schemas.microsoft.com/office/2006/metadata/properties/metaAttributes" ct:_="" ma:_="" ma:contentTypeName="Document" ma:contentTypeID="0x010100E3213E7FCD12C842BD6D52020923FEE7" ma:contentTypeVersion="15" ma:contentTypeDescription="Create a new document." ma:contentTypeScope="" ma:versionID="6d3b405af1beb79a866757960a22950a">
   <xsd:schema xmlns:xsd="http://www.w3.org/2001/XMLSchema" xmlns:xs="http://www.w3.org/2001/XMLSchema" xmlns:p="http://schemas.microsoft.com/office/2006/metadata/properties" xmlns:ns3="90d77c43-296a-4b3f-9e49-e5a41fa612db" xmlns:ns4="e753585f-8e3a-40e2-9fca-7f6a4bd74cca" targetNamespace="http://schemas.microsoft.com/office/2006/metadata/properties" ma:root="true" ma:fieldsID="becdc901ebd396f3014e96f51bd0d99a" ns3:_="" ns4:_="">
     <xsd:import namespace="90d77c43-296a-4b3f-9e49-e5a41fa612db"/>
@@ -8105,6 +8115,14 @@
 </ct:contentTypeSchema>
 </file>
 
+<file path=customXml/item2.xml><?xml version="1.0" encoding="utf-8"?>
+<p:properties xmlns:p="http://schemas.microsoft.com/office/2006/metadata/properties" xmlns:xsi="http://www.w3.org/2001/XMLSchema-instance" xmlns:pc="http://schemas.microsoft.com/office/infopath/2007/PartnerControls">
+  <documentManagement>
+    <_activity xmlns="90d77c43-296a-4b3f-9e49-e5a41fa612db" xsi:nil="true"/>
+  </documentManagement>
+</p:properties>
+</file>
+
 <file path=customXml/item3.xml><?xml version="1.0" encoding="utf-8"?>
 <?mso-contentType ?>
 <FormTemplates xmlns="http://schemas.microsoft.com/sharepoint/v3/contenttype/forms">
@@ -8115,16 +8133,6 @@
 </file>
 
 <file path=customXml/itemProps1.xml><?xml version="1.0" encoding="utf-8"?>
-<ds:datastoreItem xmlns:ds="http://schemas.openxmlformats.org/officeDocument/2006/customXml" ds:itemID="{705B0F98-4BED-42C6-BA5B-C0EA65C9A013}">
-  <ds:schemaRefs>
-    <ds:schemaRef ds:uri="http://schemas.microsoft.com/office/2006/metadata/properties"/>
-    <ds:schemaRef ds:uri="http://schemas.microsoft.com/office/infopath/2007/PartnerControls"/>
-    <ds:schemaRef ds:uri="90d77c43-296a-4b3f-9e49-e5a41fa612db"/>
-  </ds:schemaRefs>
-</ds:datastoreItem>
-</file>
-
-<file path=customXml/itemProps2.xml><?xml version="1.0" encoding="utf-8"?>
 <ds:datastoreItem xmlns:ds="http://schemas.openxmlformats.org/officeDocument/2006/customXml" ds:itemID="{827888A1-2862-4278-B896-5F4D5930CACC}">
   <ds:schemaRefs>
     <ds:schemaRef ds:uri="http://schemas.microsoft.com/office/2006/metadata/contentType"/>
@@ -8143,6 +8151,16 @@
 </ds:datastoreItem>
 </file>
 
+<file path=customXml/itemProps2.xml><?xml version="1.0" encoding="utf-8"?>
+<ds:datastoreItem xmlns:ds="http://schemas.openxmlformats.org/officeDocument/2006/customXml" ds:itemID="{705B0F98-4BED-42C6-BA5B-C0EA65C9A013}">
+  <ds:schemaRefs>
+    <ds:schemaRef ds:uri="http://schemas.microsoft.com/office/2006/metadata/properties"/>
+    <ds:schemaRef ds:uri="http://schemas.microsoft.com/office/infopath/2007/PartnerControls"/>
+    <ds:schemaRef ds:uri="90d77c43-296a-4b3f-9e49-e5a41fa612db"/>
+  </ds:schemaRefs>
+</ds:datastoreItem>
+</file>
+
 <file path=customXml/itemProps3.xml><?xml version="1.0" encoding="utf-8"?>
 <ds:datastoreItem xmlns:ds="http://schemas.openxmlformats.org/officeDocument/2006/customXml" ds:itemID="{375D1BB5-FF7A-4425-A331-134E7D149F6D}">
   <ds:schemaRefs>

</xml_diff>

<commit_message>
updated python technical documentation
</commit_message>
<xml_diff>
--- a/docs/editable/Python Technical Documentation.docx
+++ b/docs/editable/Python Technical Documentation.docx
@@ -247,7 +247,7 @@
           <w:noProof/>
         </w:rPr>
         <w:drawing>
-          <wp:inline distT="0" distB="0" distL="0" distR="0" wp14:anchorId="71AF074F" wp14:editId="4818DE4C">
+          <wp:inline distT="0" distB="0" distL="0" distR="0" wp14:anchorId="71AF074F" wp14:editId="2AD53915">
             <wp:extent cx="4529138" cy="4234950"/>
             <wp:effectExtent l="0" t="0" r="5080" b="0"/>
             <wp:docPr id="600801524" name="Picture 2"/>
@@ -1612,7 +1612,7 @@
           <w:noProof/>
         </w:rPr>
         <w:drawing>
-          <wp:inline distT="0" distB="0" distL="0" distR="0" wp14:anchorId="7711B43E" wp14:editId="28CC7E5F">
+          <wp:inline distT="0" distB="0" distL="0" distR="0" wp14:anchorId="7711B43E" wp14:editId="6068AD82">
             <wp:extent cx="5929630" cy="3181350"/>
             <wp:effectExtent l="0" t="0" r="0" b="0"/>
             <wp:docPr id="1310520674" name="Picture 3"/>
@@ -3876,7 +3876,17 @@
           <w:sz w:val="28"/>
           <w:szCs w:val="28"/>
         </w:rPr>
-        <w:t>Serial Communication</w:t>
+        <w:t xml:space="preserve">Serial </w:t>
+      </w:r>
+      <w:r>
+        <w:rPr>
+          <w:rFonts w:ascii="Times New Roman" w:hAnsi="Times New Roman" w:cs="Times New Roman"/>
+          <w:b/>
+          <w:bCs/>
+          <w:sz w:val="28"/>
+          <w:szCs w:val="28"/>
+        </w:rPr>
+        <w:t>Manager</w:t>
       </w:r>
     </w:p>
     <w:p>
@@ -3895,41 +3905,87 @@
         <w:rPr>
           <w:rFonts w:ascii="Times New Roman" w:hAnsi="Times New Roman" w:cs="Times New Roman"/>
         </w:rPr>
-        <w:t xml:space="preserve">This file implements serial communication with the test fixture using </w:t>
-      </w:r>
-      <w:r>
-        <w:rPr>
-          <w:rFonts w:ascii="Times New Roman" w:hAnsi="Times New Roman" w:cs="Times New Roman"/>
-        </w:rPr>
-        <w:t xml:space="preserve">classes derived from the base class </w:t>
-      </w:r>
-      <w:proofErr w:type="spellStart"/>
-      <w:r>
-        <w:rPr>
-          <w:rFonts w:ascii="Times New Roman" w:hAnsi="Times New Roman" w:cs="Times New Roman"/>
-        </w:rPr>
-        <w:t>SerialCommunication</w:t>
-      </w:r>
-      <w:proofErr w:type="spellEnd"/>
+        <w:t>This file implements serial communication with the test fixture</w:t>
+      </w:r>
       <w:r>
         <w:rPr>
           <w:rFonts w:ascii="Times New Roman" w:hAnsi="Times New Roman" w:cs="Times New Roman"/>
         </w:rPr>
         <w:t xml:space="preserve">. </w:t>
       </w:r>
-      <w:proofErr w:type="spellStart"/>
-      <w:r>
-        <w:rPr>
-          <w:rFonts w:ascii="Times New Roman" w:hAnsi="Times New Roman" w:cs="Times New Roman"/>
-        </w:rPr>
-        <w:t>SerialCommunication</w:t>
-      </w:r>
-      <w:proofErr w:type="spellEnd"/>
-      <w:r>
-        <w:rPr>
-          <w:rFonts w:ascii="Times New Roman" w:hAnsi="Times New Roman" w:cs="Times New Roman"/>
-        </w:rPr>
-        <w:t xml:space="preserve"> contains the signals done, error, and </w:t>
+      <w:r>
+        <w:rPr>
+          <w:rFonts w:ascii="Times New Roman" w:hAnsi="Times New Roman" w:cs="Times New Roman"/>
+        </w:rPr>
+        <w:t xml:space="preserve">The </w:t>
+      </w:r>
+      <w:proofErr w:type="spellStart"/>
+      <w:r>
+        <w:rPr>
+          <w:rFonts w:ascii="Times New Roman" w:hAnsi="Times New Roman" w:cs="Times New Roman"/>
+        </w:rPr>
+        <w:t>SerialManager</w:t>
+      </w:r>
+      <w:proofErr w:type="spellEnd"/>
+      <w:r>
+        <w:rPr>
+          <w:rFonts w:ascii="Times New Roman" w:hAnsi="Times New Roman" w:cs="Times New Roman"/>
+        </w:rPr>
+        <w:t xml:space="preserve"> class is responsible for serial communication. The </w:t>
+      </w:r>
+      <w:proofErr w:type="spellStart"/>
+      <w:r>
+        <w:rPr>
+          <w:rFonts w:ascii="Times New Roman" w:hAnsi="Times New Roman" w:cs="Times New Roman"/>
+        </w:rPr>
+        <w:t>SerialProtocol</w:t>
+      </w:r>
+      <w:proofErr w:type="spellEnd"/>
+      <w:r>
+        <w:rPr>
+          <w:rFonts w:ascii="Times New Roman" w:hAnsi="Times New Roman" w:cs="Times New Roman"/>
+        </w:rPr>
+        <w:t xml:space="preserve"> </w:t>
+      </w:r>
+      <w:r>
+        <w:rPr>
+          <w:rFonts w:ascii="Times New Roman" w:hAnsi="Times New Roman" w:cs="Times New Roman"/>
+        </w:rPr>
+        <w:t>base class</w:t>
+      </w:r>
+      <w:r>
+        <w:rPr>
+          <w:rFonts w:ascii="Times New Roman" w:hAnsi="Times New Roman" w:cs="Times New Roman"/>
+        </w:rPr>
+        <w:t xml:space="preserve"> is the recommended template to implement different types of communication protocols. </w:t>
+      </w:r>
+      <w:proofErr w:type="spellStart"/>
+      <w:proofErr w:type="gramStart"/>
+      <w:r>
+        <w:rPr>
+          <w:rFonts w:ascii="Times New Roman" w:hAnsi="Times New Roman" w:cs="Times New Roman"/>
+        </w:rPr>
+        <w:t>Serial</w:t>
+      </w:r>
+      <w:r>
+        <w:rPr>
+          <w:rFonts w:ascii="Times New Roman" w:hAnsi="Times New Roman" w:cs="Times New Roman"/>
+        </w:rPr>
+        <w:t>Manager</w:t>
+      </w:r>
+      <w:proofErr w:type="spellEnd"/>
+      <w:proofErr w:type="gramEnd"/>
+      <w:r>
+        <w:rPr>
+          <w:rFonts w:ascii="Times New Roman" w:hAnsi="Times New Roman" w:cs="Times New Roman"/>
+        </w:rPr>
+        <w:t xml:space="preserve"> </w:t>
+      </w:r>
+      <w:r>
+        <w:rPr>
+          <w:rFonts w:ascii="Times New Roman" w:hAnsi="Times New Roman" w:cs="Times New Roman"/>
+        </w:rPr>
+        <w:t xml:space="preserve">contains the signals done, error, and </w:t>
       </w:r>
       <w:proofErr w:type="spellStart"/>
       <w:r>
@@ -3943,6 +3999,20 @@
         <w:rPr>
           <w:rFonts w:ascii="Times New Roman" w:hAnsi="Times New Roman" w:cs="Times New Roman"/>
         </w:rPr>
+        <w:t xml:space="preserve">, and </w:t>
+      </w:r>
+      <w:proofErr w:type="spellStart"/>
+      <w:r>
+        <w:rPr>
+          <w:rFonts w:ascii="Times New Roman" w:hAnsi="Times New Roman" w:cs="Times New Roman"/>
+        </w:rPr>
+        <w:t>line_received</w:t>
+      </w:r>
+      <w:proofErr w:type="spellEnd"/>
+      <w:r>
+        <w:rPr>
+          <w:rFonts w:ascii="Times New Roman" w:hAnsi="Times New Roman" w:cs="Times New Roman"/>
+        </w:rPr>
         <w:t xml:space="preserve">. These signals are intended to </w:t>
       </w:r>
       <w:r>
@@ -3961,130 +4031,6 @@
         <w:rPr>
           <w:rFonts w:ascii="Times New Roman" w:hAnsi="Times New Roman" w:cs="Times New Roman"/>
         </w:rPr>
-        <w:t xml:space="preserve"> The base class contains the reference to a </w:t>
-      </w:r>
-      <w:proofErr w:type="spellStart"/>
-      <w:r>
-        <w:rPr>
-          <w:rFonts w:ascii="Times New Roman" w:hAnsi="Times New Roman" w:cs="Times New Roman"/>
-        </w:rPr>
-        <w:t>QSerialPort</w:t>
-      </w:r>
-      <w:proofErr w:type="spellEnd"/>
-      <w:r>
-        <w:rPr>
-          <w:rFonts w:ascii="Times New Roman" w:hAnsi="Times New Roman" w:cs="Times New Roman"/>
-        </w:rPr>
-        <w:t xml:space="preserve">, a buffer for </w:t>
-      </w:r>
-      <w:r>
-        <w:rPr>
-          <w:rFonts w:ascii="Times New Roman" w:hAnsi="Times New Roman" w:cs="Times New Roman"/>
-        </w:rPr>
-        <w:t>all the responses</w:t>
-      </w:r>
-      <w:r>
-        <w:rPr>
-          <w:rFonts w:ascii="Times New Roman" w:hAnsi="Times New Roman" w:cs="Times New Roman"/>
-        </w:rPr>
-        <w:t xml:space="preserve">. The </w:t>
-      </w:r>
-      <w:proofErr w:type="spellStart"/>
-      <w:r>
-        <w:rPr>
-          <w:rFonts w:ascii="Times New Roman" w:hAnsi="Times New Roman" w:cs="Times New Roman"/>
-        </w:rPr>
-        <w:t>readyRead</w:t>
-      </w:r>
-      <w:proofErr w:type="spellEnd"/>
-      <w:r>
-        <w:rPr>
-          <w:rFonts w:ascii="Times New Roman" w:hAnsi="Times New Roman" w:cs="Times New Roman"/>
-        </w:rPr>
-        <w:t xml:space="preserve"> signal from </w:t>
-      </w:r>
-      <w:proofErr w:type="spellStart"/>
-      <w:r>
-        <w:rPr>
-          <w:rFonts w:ascii="Times New Roman" w:hAnsi="Times New Roman" w:cs="Times New Roman"/>
-        </w:rPr>
-        <w:t>QSerialPort</w:t>
-      </w:r>
-      <w:proofErr w:type="spellEnd"/>
-      <w:r>
-        <w:rPr>
-          <w:rFonts w:ascii="Times New Roman" w:hAnsi="Times New Roman" w:cs="Times New Roman"/>
-        </w:rPr>
-        <w:t xml:space="preserve"> is connected to the </w:t>
-      </w:r>
-      <w:proofErr w:type="spellStart"/>
-      <w:r>
-        <w:rPr>
-          <w:rFonts w:ascii="Times New Roman" w:hAnsi="Times New Roman" w:cs="Times New Roman"/>
-        </w:rPr>
-        <w:t>handle_ready_read</w:t>
-      </w:r>
-      <w:proofErr w:type="spellEnd"/>
-      <w:r>
-        <w:rPr>
-          <w:rFonts w:ascii="Times New Roman" w:hAnsi="Times New Roman" w:cs="Times New Roman"/>
-        </w:rPr>
-        <w:t xml:space="preserve"> function. This function will add </w:t>
-      </w:r>
-      <w:r>
-        <w:rPr>
-          <w:rFonts w:ascii="Times New Roman" w:hAnsi="Times New Roman" w:cs="Times New Roman"/>
-        </w:rPr>
-        <w:t>all</w:t>
-      </w:r>
-      <w:r>
-        <w:rPr>
-          <w:rFonts w:ascii="Times New Roman" w:hAnsi="Times New Roman" w:cs="Times New Roman"/>
-        </w:rPr>
-        <w:t xml:space="preserve"> the responses from the hardware to the </w:t>
-      </w:r>
-      <w:r>
-        <w:rPr>
-          <w:rFonts w:ascii="Times New Roman" w:hAnsi="Times New Roman" w:cs="Times New Roman"/>
-        </w:rPr>
-        <w:t>buffer and</w:t>
-      </w:r>
-      <w:r>
-        <w:rPr>
-          <w:rFonts w:ascii="Times New Roman" w:hAnsi="Times New Roman" w:cs="Times New Roman"/>
-        </w:rPr>
-        <w:t xml:space="preserve"> call </w:t>
-      </w:r>
-      <w:proofErr w:type="spellStart"/>
-      <w:r>
-        <w:rPr>
-          <w:rFonts w:ascii="Times New Roman" w:hAnsi="Times New Roman" w:cs="Times New Roman"/>
-        </w:rPr>
-        <w:t>process_line</w:t>
-      </w:r>
-      <w:proofErr w:type="spellEnd"/>
-      <w:r>
-        <w:rPr>
-          <w:rFonts w:ascii="Times New Roman" w:hAnsi="Times New Roman" w:cs="Times New Roman"/>
-        </w:rPr>
-        <w:t xml:space="preserve"> for every line in the buffer.</w:t>
-      </w:r>
-      <w:r>
-        <w:rPr>
-          <w:rFonts w:ascii="Times New Roman" w:hAnsi="Times New Roman" w:cs="Times New Roman"/>
-        </w:rPr>
-        <w:t xml:space="preserve"> The </w:t>
-      </w:r>
-      <w:r>
-        <w:rPr>
-          <w:rFonts w:ascii="Times New Roman" w:hAnsi="Times New Roman" w:cs="Times New Roman"/>
-        </w:rPr>
-        <w:t>methods start and</w:t>
-      </w:r>
-      <w:r>
-        <w:rPr>
-          <w:rFonts w:ascii="Times New Roman" w:hAnsi="Times New Roman" w:cs="Times New Roman"/>
-        </w:rPr>
         <w:t xml:space="preserve"> </w:t>
       </w:r>
       <w:proofErr w:type="spellStart"/>
@@ -4092,47 +4038,96 @@
         <w:rPr>
           <w:rFonts w:ascii="Times New Roman" w:hAnsi="Times New Roman" w:cs="Times New Roman"/>
         </w:rPr>
-        <w:t>process_line</w:t>
-      </w:r>
-      <w:proofErr w:type="spellEnd"/>
-      <w:r>
-        <w:rPr>
-          <w:rFonts w:ascii="Times New Roman" w:hAnsi="Times New Roman" w:cs="Times New Roman"/>
-        </w:rPr>
-        <w:t>, must be implemented by each derived class.</w:t>
-      </w:r>
-      <w:r>
-        <w:rPr>
-          <w:rFonts w:ascii="Times New Roman" w:hAnsi="Times New Roman" w:cs="Times New Roman"/>
-        </w:rPr>
-        <w:t xml:space="preserve"> The start function is </w:t>
-      </w:r>
-      <w:r>
-        <w:rPr>
-          <w:rFonts w:ascii="Times New Roman" w:hAnsi="Times New Roman" w:cs="Times New Roman"/>
-        </w:rPr>
-        <w:t>the intended way to start serial communication.</w:t>
-      </w:r>
-      <w:r>
-        <w:rPr>
-          <w:rFonts w:ascii="Times New Roman" w:hAnsi="Times New Roman" w:cs="Times New Roman"/>
-        </w:rPr>
-        <w:t xml:space="preserve"> This function will check if the </w:t>
-      </w:r>
-      <w:proofErr w:type="spellStart"/>
-      <w:r>
-        <w:rPr>
-          <w:rFonts w:ascii="Times New Roman" w:hAnsi="Times New Roman" w:cs="Times New Roman"/>
-        </w:rPr>
-        <w:t>QSerialPort</w:t>
-      </w:r>
-      <w:proofErr w:type="spellEnd"/>
-      <w:r>
-        <w:rPr>
-          <w:rFonts w:ascii="Times New Roman" w:hAnsi="Times New Roman" w:cs="Times New Roman"/>
-        </w:rPr>
-        <w:t xml:space="preserve"> is open, if not an error is displayed in the main window.</w:t>
-      </w:r>
+        <w:t>SerialManager</w:t>
+      </w:r>
+      <w:proofErr w:type="spellEnd"/>
+      <w:r>
+        <w:rPr>
+          <w:rFonts w:ascii="Times New Roman" w:hAnsi="Times New Roman" w:cs="Times New Roman"/>
+        </w:rPr>
+        <w:t xml:space="preserve"> maintains a buffer for all responses received by the test </w:t>
+      </w:r>
+      <w:proofErr w:type="gramStart"/>
+      <w:r>
+        <w:rPr>
+          <w:rFonts w:ascii="Times New Roman" w:hAnsi="Times New Roman" w:cs="Times New Roman"/>
+        </w:rPr>
+        <w:t>fixture, and</w:t>
+      </w:r>
+      <w:proofErr w:type="gramEnd"/>
+      <w:r>
+        <w:rPr>
+          <w:rFonts w:ascii="Times New Roman" w:hAnsi="Times New Roman" w:cs="Times New Roman"/>
+        </w:rPr>
+        <w:t xml:space="preserve"> keeps track of the current active protocol. </w:t>
+      </w:r>
+    </w:p>
+    <w:p>
+      <w:pPr>
+        <w:spacing w:line="276" w:lineRule="auto"/>
+        <w:rPr>
+          <w:rFonts w:ascii="Times New Roman" w:hAnsi="Times New Roman" w:cs="Times New Roman"/>
+        </w:rPr>
+      </w:pPr>
+      <w:r>
+        <w:rPr>
+          <w:rFonts w:ascii="Times New Roman" w:hAnsi="Times New Roman" w:cs="Times New Roman"/>
+        </w:rPr>
+        <w:t xml:space="preserve">The BIST class </w:t>
+      </w:r>
+      <w:r>
+        <w:rPr>
+          <w:rFonts w:ascii="Times New Roman" w:hAnsi="Times New Roman" w:cs="Times New Roman"/>
+        </w:rPr>
+        <w:t xml:space="preserve">sends the “BIST” command to trigger the Built-In </w:t>
+      </w:r>
+      <w:proofErr w:type="spellStart"/>
+      <w:r>
+        <w:rPr>
+          <w:rFonts w:ascii="Times New Roman" w:hAnsi="Times New Roman" w:cs="Times New Roman"/>
+        </w:rPr>
+        <w:t>Self Test</w:t>
+      </w:r>
+      <w:proofErr w:type="spellEnd"/>
+      <w:r>
+        <w:rPr>
+          <w:rFonts w:ascii="Times New Roman" w:hAnsi="Times New Roman" w:cs="Times New Roman"/>
+        </w:rPr>
+        <w:t xml:space="preserve"> feature of the test fixture. The fixture will test</w:t>
+      </w:r>
+      <w:r>
+        <w:rPr>
+          <w:rFonts w:ascii="Times New Roman" w:hAnsi="Times New Roman" w:cs="Times New Roman"/>
+        </w:rPr>
+        <w:t xml:space="preserve"> the hardware peripherals</w:t>
+      </w:r>
+      <w:r>
+        <w:rPr>
+          <w:rFonts w:ascii="Times New Roman" w:hAnsi="Times New Roman" w:cs="Times New Roman"/>
+        </w:rPr>
+        <w:t xml:space="preserve"> exhaustively </w:t>
+      </w:r>
+      <w:r>
+        <w:rPr>
+          <w:rFonts w:ascii="Times New Roman" w:hAnsi="Times New Roman" w:cs="Times New Roman"/>
+        </w:rPr>
+        <w:t xml:space="preserve">to verify </w:t>
+      </w:r>
+      <w:r>
+        <w:rPr>
+          <w:rFonts w:ascii="Times New Roman" w:hAnsi="Times New Roman" w:cs="Times New Roman"/>
+        </w:rPr>
+        <w:t>the circuit is operating within the thresholds.</w:t>
+      </w:r>
+    </w:p>
+    <w:p>
+      <w:pPr>
+        <w:spacing w:line="276" w:lineRule="auto"/>
+        <w:jc w:val="center"/>
+        <w:rPr>
+          <w:rFonts w:ascii="Times New Roman" w:hAnsi="Times New Roman" w:cs="Times New Roman"/>
+        </w:rPr>
+      </w:pPr>
       <w:r>
         <w:rPr>
           <w:rFonts w:ascii="Times New Roman" w:hAnsi="Times New Roman" w:cs="Times New Roman"/>
@@ -4142,90 +4137,12 @@
           <w:sz w:val="28"/>
           <w:szCs w:val="28"/>
         </w:rPr>
-        <w:t xml:space="preserve"> </w:t>
-      </w:r>
-    </w:p>
-    <w:p>
-      <w:pPr>
-        <w:spacing w:line="276" w:lineRule="auto"/>
-        <w:rPr>
-          <w:rFonts w:ascii="Times New Roman" w:hAnsi="Times New Roman" w:cs="Times New Roman"/>
-        </w:rPr>
-      </w:pPr>
-      <w:r>
-        <w:rPr>
-          <w:rFonts w:ascii="Times New Roman" w:hAnsi="Times New Roman" w:cs="Times New Roman"/>
-        </w:rPr>
-        <w:t xml:space="preserve">The BIST class </w:t>
-      </w:r>
-      <w:r>
-        <w:rPr>
-          <w:rFonts w:ascii="Times New Roman" w:hAnsi="Times New Roman" w:cs="Times New Roman"/>
-        </w:rPr>
-        <w:t xml:space="preserve">sends the “BIST” command to trigger the Built-In </w:t>
-      </w:r>
-      <w:proofErr w:type="spellStart"/>
-      <w:r>
-        <w:rPr>
-          <w:rFonts w:ascii="Times New Roman" w:hAnsi="Times New Roman" w:cs="Times New Roman"/>
-        </w:rPr>
-        <w:t>Self Test</w:t>
-      </w:r>
-      <w:proofErr w:type="spellEnd"/>
-      <w:r>
-        <w:rPr>
-          <w:rFonts w:ascii="Times New Roman" w:hAnsi="Times New Roman" w:cs="Times New Roman"/>
-        </w:rPr>
-        <w:t xml:space="preserve"> feature of the test fixture. The fixture will test</w:t>
-      </w:r>
-      <w:r>
-        <w:rPr>
-          <w:rFonts w:ascii="Times New Roman" w:hAnsi="Times New Roman" w:cs="Times New Roman"/>
-        </w:rPr>
-        <w:t xml:space="preserve"> the hardware peripherals</w:t>
-      </w:r>
-      <w:r>
-        <w:rPr>
-          <w:rFonts w:ascii="Times New Roman" w:hAnsi="Times New Roman" w:cs="Times New Roman"/>
-        </w:rPr>
-        <w:t xml:space="preserve"> exhaustively </w:t>
-      </w:r>
-      <w:r>
-        <w:rPr>
-          <w:rFonts w:ascii="Times New Roman" w:hAnsi="Times New Roman" w:cs="Times New Roman"/>
-        </w:rPr>
-        <w:t xml:space="preserve">to verify </w:t>
-      </w:r>
-      <w:r>
-        <w:rPr>
-          <w:rFonts w:ascii="Times New Roman" w:hAnsi="Times New Roman" w:cs="Times New Roman"/>
-        </w:rPr>
-        <w:t>the circuit is operating within the thresholds.</w:t>
-      </w:r>
-    </w:p>
-    <w:p>
-      <w:pPr>
-        <w:spacing w:line="276" w:lineRule="auto"/>
-        <w:jc w:val="center"/>
-        <w:rPr>
-          <w:rFonts w:ascii="Times New Roman" w:hAnsi="Times New Roman" w:cs="Times New Roman"/>
-        </w:rPr>
-      </w:pPr>
-      <w:r>
-        <w:rPr>
-          <w:rFonts w:ascii="Times New Roman" w:hAnsi="Times New Roman" w:cs="Times New Roman"/>
-          <w:b/>
-          <w:bCs/>
-          <w:noProof/>
-          <w:sz w:val="28"/>
-          <w:szCs w:val="28"/>
-        </w:rPr>
         <w:lastRenderedPageBreak/>
         <w:drawing>
-          <wp:inline distT="0" distB="0" distL="0" distR="0" wp14:anchorId="0F476EFE" wp14:editId="2137A841">
-            <wp:extent cx="3589786" cy="4395788"/>
-            <wp:effectExtent l="0" t="0" r="0" b="5080"/>
-            <wp:docPr id="1147879699" name="Picture 3"/>
+          <wp:inline distT="0" distB="0" distL="0" distR="0" wp14:anchorId="34397260" wp14:editId="4221F051">
+            <wp:extent cx="5368854" cy="4572000"/>
+            <wp:effectExtent l="0" t="0" r="3810" b="0"/>
+            <wp:docPr id="1635896170" name="Picture 2"/>
             <wp:cNvGraphicFramePr>
               <a:graphicFrameLocks xmlns:a="http://schemas.openxmlformats.org/drawingml/2006/main" noChangeAspect="1"/>
             </wp:cNvGraphicFramePr>
@@ -4233,7 +4150,7 @@
               <a:graphicData uri="http://schemas.openxmlformats.org/drawingml/2006/picture">
                 <pic:pic xmlns:pic="http://schemas.openxmlformats.org/drawingml/2006/picture">
                   <pic:nvPicPr>
-                    <pic:cNvPr id="0" name="Picture 3"/>
+                    <pic:cNvPr id="0" name="Picture 2"/>
                     <pic:cNvPicPr>
                       <a:picLocks noChangeAspect="1" noChangeArrowheads="1"/>
                     </pic:cNvPicPr>
@@ -4254,7 +4171,7 @@
                   <pic:spPr bwMode="auto">
                     <a:xfrm>
                       <a:off x="0" y="0"/>
-                      <a:ext cx="3609285" cy="4419665"/>
+                      <a:ext cx="5371207" cy="4574004"/>
                     </a:xfrm>
                     <a:prstGeom prst="rect">
                       <a:avLst/>
@@ -4508,10 +4425,10 @@
           <w:szCs w:val="28"/>
         </w:rPr>
         <w:drawing>
-          <wp:inline distT="0" distB="0" distL="0" distR="0" wp14:anchorId="269239B7" wp14:editId="5DFF2B94">
-            <wp:extent cx="5939155" cy="4681855"/>
+          <wp:inline distT="0" distB="0" distL="0" distR="0" wp14:anchorId="70F40ADF" wp14:editId="2B869240">
+            <wp:extent cx="5939155" cy="4662805"/>
             <wp:effectExtent l="0" t="0" r="4445" b="4445"/>
-            <wp:docPr id="1270986687" name="Picture 2"/>
+            <wp:docPr id="478163762" name="Picture 1"/>
             <wp:cNvGraphicFramePr>
               <a:graphicFrameLocks xmlns:a="http://schemas.openxmlformats.org/drawingml/2006/main" noChangeAspect="1"/>
             </wp:cNvGraphicFramePr>
@@ -4519,7 +4436,7 @@
               <a:graphicData uri="http://schemas.openxmlformats.org/drawingml/2006/picture">
                 <pic:pic xmlns:pic="http://schemas.openxmlformats.org/drawingml/2006/picture">
                   <pic:nvPicPr>
-                    <pic:cNvPr id="0" name="Picture 2"/>
+                    <pic:cNvPr id="0" name="Picture 1"/>
                     <pic:cNvPicPr>
                       <a:picLocks noChangeAspect="1" noChangeArrowheads="1"/>
                     </pic:cNvPicPr>
@@ -4540,7 +4457,7 @@
                   <pic:spPr bwMode="auto">
                     <a:xfrm>
                       <a:off x="0" y="0"/>
-                      <a:ext cx="5939155" cy="4681855"/>
+                      <a:ext cx="5939155" cy="4662805"/>
                     </a:xfrm>
                     <a:prstGeom prst="rect">
                       <a:avLst/>
@@ -5973,7 +5890,19 @@
         <w:rPr>
           <w:rFonts w:ascii="Times New Roman" w:hAnsi="Times New Roman" w:cs="Times New Roman"/>
         </w:rPr>
-        <w:t>To maintain the project’s structure, it is important to create any new source files inside a module, whether it’s an existing one listed in Table 1.1, or a new module (or submodule) if the source code implements a distinct new feature. The __init__.py file indicates to the Python interpreter that a directory is a package; while not required, it is still highly recommended for modern Python projects. The main.py file should likely not be changed unless the GUI color palette is desired. This file serves as the user entry point of the application and should never implement any core logic or features.</w:t>
+        <w:t xml:space="preserve">To maintain the project’s structure, it is important to create any new source files inside a module, whether it’s an existing one listed in Table 1.1, or a new module (or submodule) if the source code implements a distinct new feature. The __init__.py file indicates to the Python interpreter that a directory is a package; while not required, it is still highly recommended for modern Python projects. The main.py file should likely not be changed unless </w:t>
+      </w:r>
+      <w:r>
+        <w:rPr>
+          <w:rFonts w:ascii="Times New Roman" w:hAnsi="Times New Roman" w:cs="Times New Roman"/>
+        </w:rPr>
+        <w:t>there is startup logic that should be conducted before showing the main window or a different color palette is desired.</w:t>
+      </w:r>
+      <w:r>
+        <w:rPr>
+          <w:rFonts w:ascii="Times New Roman" w:hAnsi="Times New Roman" w:cs="Times New Roman"/>
+        </w:rPr>
+        <w:t xml:space="preserve"> This file serves as the user entry point of the application and should never implement any core logic or features.</w:t>
       </w:r>
     </w:p>
     <w:p>
@@ -6057,7 +5986,14 @@
         <w:rPr>
           <w:rFonts w:ascii="Times New Roman" w:hAnsi="Times New Roman" w:cs="Times New Roman"/>
         </w:rPr>
-        <w:t xml:space="preserve">. PySide6 documentation recommends using the worker approach, where a </w:t>
+        <w:t xml:space="preserve">. PySide6 documentation </w:t>
+      </w:r>
+      <w:r>
+        <w:rPr>
+          <w:rFonts w:ascii="Times New Roman" w:hAnsi="Times New Roman" w:cs="Times New Roman"/>
+        </w:rPr>
+        <w:lastRenderedPageBreak/>
+        <w:t xml:space="preserve">recommends using the worker approach, where a </w:t>
       </w:r>
       <w:proofErr w:type="spellStart"/>
       <w:r>
@@ -6085,14 +6021,7 @@
         <w:rPr>
           <w:rFonts w:ascii="Times New Roman" w:hAnsi="Times New Roman" w:cs="Times New Roman"/>
         </w:rPr>
-        <w:t xml:space="preserve"> to </w:t>
-      </w:r>
-      <w:r>
-        <w:rPr>
-          <w:rFonts w:ascii="Times New Roman" w:hAnsi="Times New Roman" w:cs="Times New Roman"/>
-        </w:rPr>
-        <w:lastRenderedPageBreak/>
-        <w:t xml:space="preserve">separate the logic you want to run from the responsibilities of </w:t>
+        <w:t xml:space="preserve"> to separate the logic you want to run from the responsibilities of </w:t>
       </w:r>
       <w:proofErr w:type="spellStart"/>
       <w:r>
@@ -6136,6 +6065,54 @@
           <w:rFonts w:ascii="Times New Roman" w:hAnsi="Times New Roman" w:cs="Times New Roman"/>
         </w:rPr>
         <w:t xml:space="preserve"> objects were not used.</w:t>
+      </w:r>
+      <w:r>
+        <w:rPr>
+          <w:rFonts w:ascii="Times New Roman" w:hAnsi="Times New Roman" w:cs="Times New Roman"/>
+        </w:rPr>
+        <w:t xml:space="preserve"> It is highly recommended to use the </w:t>
+      </w:r>
+      <w:proofErr w:type="spellStart"/>
+      <w:r>
+        <w:rPr>
+          <w:rFonts w:ascii="Times New Roman" w:hAnsi="Times New Roman" w:cs="Times New Roman"/>
+        </w:rPr>
+        <w:t>SerialManager</w:t>
+      </w:r>
+      <w:proofErr w:type="spellEnd"/>
+      <w:r>
+        <w:rPr>
+          <w:rFonts w:ascii="Times New Roman" w:hAnsi="Times New Roman" w:cs="Times New Roman"/>
+        </w:rPr>
+        <w:t xml:space="preserve"> to manage all serial </w:t>
+      </w:r>
+      <w:proofErr w:type="gramStart"/>
+      <w:r>
+        <w:rPr>
+          <w:rFonts w:ascii="Times New Roman" w:hAnsi="Times New Roman" w:cs="Times New Roman"/>
+        </w:rPr>
+        <w:t>communication, and</w:t>
+      </w:r>
+      <w:proofErr w:type="gramEnd"/>
+      <w:r>
+        <w:rPr>
+          <w:rFonts w:ascii="Times New Roman" w:hAnsi="Times New Roman" w:cs="Times New Roman"/>
+        </w:rPr>
+        <w:t xml:space="preserve"> declare a </w:t>
+      </w:r>
+      <w:proofErr w:type="spellStart"/>
+      <w:r>
+        <w:rPr>
+          <w:rFonts w:ascii="Times New Roman" w:hAnsi="Times New Roman" w:cs="Times New Roman"/>
+        </w:rPr>
+        <w:t>SerialProtocol</w:t>
+      </w:r>
+      <w:proofErr w:type="spellEnd"/>
+      <w:r>
+        <w:rPr>
+          <w:rFonts w:ascii="Times New Roman" w:hAnsi="Times New Roman" w:cs="Times New Roman"/>
+        </w:rPr>
+        <w:t xml:space="preserve"> subclass to manager different types of communication protocols.</w:t>
       </w:r>
     </w:p>
     <w:p>
@@ -7883,6 +7860,14 @@
 </file>
 
 <file path=customXml/item1.xml><?xml version="1.0" encoding="utf-8"?>
+<p:properties xmlns:p="http://schemas.microsoft.com/office/2006/metadata/properties" xmlns:xsi="http://www.w3.org/2001/XMLSchema-instance" xmlns:pc="http://schemas.microsoft.com/office/infopath/2007/PartnerControls">
+  <documentManagement>
+    <_activity xmlns="90d77c43-296a-4b3f-9e49-e5a41fa612db" xsi:nil="true"/>
+  </documentManagement>
+</p:properties>
+</file>
+
+<file path=customXml/item2.xml><?xml version="1.0" encoding="utf-8"?>
 <ct:contentTypeSchema xmlns:ct="http://schemas.microsoft.com/office/2006/metadata/contentType" xmlns:ma="http://schemas.microsoft.com/office/2006/metadata/properties/metaAttributes" ct:_="" ma:_="" ma:contentTypeName="Document" ma:contentTypeID="0x010100E3213E7FCD12C842BD6D52020923FEE7" ma:contentTypeVersion="15" ma:contentTypeDescription="Create a new document." ma:contentTypeScope="" ma:versionID="6d3b405af1beb79a866757960a22950a">
   <xsd:schema xmlns:xsd="http://www.w3.org/2001/XMLSchema" xmlns:xs="http://www.w3.org/2001/XMLSchema" xmlns:p="http://schemas.microsoft.com/office/2006/metadata/properties" xmlns:ns3="90d77c43-296a-4b3f-9e49-e5a41fa612db" xmlns:ns4="e753585f-8e3a-40e2-9fca-7f6a4bd74cca" targetNamespace="http://schemas.microsoft.com/office/2006/metadata/properties" ma:root="true" ma:fieldsID="becdc901ebd396f3014e96f51bd0d99a" ns3:_="" ns4:_="">
     <xsd:import namespace="90d77c43-296a-4b3f-9e49-e5a41fa612db"/>
@@ -8115,14 +8100,6 @@
 </ct:contentTypeSchema>
 </file>
 
-<file path=customXml/item2.xml><?xml version="1.0" encoding="utf-8"?>
-<p:properties xmlns:p="http://schemas.microsoft.com/office/2006/metadata/properties" xmlns:xsi="http://www.w3.org/2001/XMLSchema-instance" xmlns:pc="http://schemas.microsoft.com/office/infopath/2007/PartnerControls">
-  <documentManagement>
-    <_activity xmlns="90d77c43-296a-4b3f-9e49-e5a41fa612db" xsi:nil="true"/>
-  </documentManagement>
-</p:properties>
-</file>
-
 <file path=customXml/item3.xml><?xml version="1.0" encoding="utf-8"?>
 <?mso-contentType ?>
 <FormTemplates xmlns="http://schemas.microsoft.com/sharepoint/v3/contenttype/forms">
@@ -8133,6 +8110,16 @@
 </file>
 
 <file path=customXml/itemProps1.xml><?xml version="1.0" encoding="utf-8"?>
+<ds:datastoreItem xmlns:ds="http://schemas.openxmlformats.org/officeDocument/2006/customXml" ds:itemID="{705B0F98-4BED-42C6-BA5B-C0EA65C9A013}">
+  <ds:schemaRefs>
+    <ds:schemaRef ds:uri="http://schemas.microsoft.com/office/2006/metadata/properties"/>
+    <ds:schemaRef ds:uri="http://schemas.microsoft.com/office/infopath/2007/PartnerControls"/>
+    <ds:schemaRef ds:uri="90d77c43-296a-4b3f-9e49-e5a41fa612db"/>
+  </ds:schemaRefs>
+</ds:datastoreItem>
+</file>
+
+<file path=customXml/itemProps2.xml><?xml version="1.0" encoding="utf-8"?>
 <ds:datastoreItem xmlns:ds="http://schemas.openxmlformats.org/officeDocument/2006/customXml" ds:itemID="{827888A1-2862-4278-B896-5F4D5930CACC}">
   <ds:schemaRefs>
     <ds:schemaRef ds:uri="http://schemas.microsoft.com/office/2006/metadata/contentType"/>
@@ -8151,16 +8138,6 @@
 </ds:datastoreItem>
 </file>
 
-<file path=customXml/itemProps2.xml><?xml version="1.0" encoding="utf-8"?>
-<ds:datastoreItem xmlns:ds="http://schemas.openxmlformats.org/officeDocument/2006/customXml" ds:itemID="{705B0F98-4BED-42C6-BA5B-C0EA65C9A013}">
-  <ds:schemaRefs>
-    <ds:schemaRef ds:uri="http://schemas.microsoft.com/office/2006/metadata/properties"/>
-    <ds:schemaRef ds:uri="http://schemas.microsoft.com/office/infopath/2007/PartnerControls"/>
-    <ds:schemaRef ds:uri="90d77c43-296a-4b3f-9e49-e5a41fa612db"/>
-  </ds:schemaRefs>
-</ds:datastoreItem>
-</file>
-
 <file path=customXml/itemProps3.xml><?xml version="1.0" encoding="utf-8"?>
 <ds:datastoreItem xmlns:ds="http://schemas.openxmlformats.org/officeDocument/2006/customXml" ds:itemID="{375D1BB5-FF7A-4425-A331-134E7D149F6D}">
   <ds:schemaRefs>

</xml_diff>

<commit_message>
edited READMEs for consistency
Co-authored-by: Copilot <copilot@github.com>
</commit_message>
<xml_diff>
--- a/docs/editable/Python Technical Documentation.docx
+++ b/docs/editable/Python Technical Documentation.docx
@@ -247,10 +247,10 @@
           <w:noProof/>
         </w:rPr>
         <w:drawing>
-          <wp:inline distT="0" distB="0" distL="0" distR="0" wp14:anchorId="71AF074F" wp14:editId="2AD53915">
-            <wp:extent cx="4529138" cy="4234950"/>
-            <wp:effectExtent l="0" t="0" r="5080" b="0"/>
-            <wp:docPr id="600801524" name="Picture 2"/>
+          <wp:inline distT="0" distB="0" distL="0" distR="0" wp14:anchorId="1238FBFA" wp14:editId="383313A1">
+            <wp:extent cx="4833232" cy="4519144"/>
+            <wp:effectExtent l="0" t="0" r="5715" b="0"/>
+            <wp:docPr id="1703594554" name="Picture 1"/>
             <wp:cNvGraphicFramePr>
               <a:graphicFrameLocks xmlns:a="http://schemas.openxmlformats.org/drawingml/2006/main" noChangeAspect="1"/>
             </wp:cNvGraphicFramePr>
@@ -258,13 +258,13 @@
               <a:graphicData uri="http://schemas.openxmlformats.org/drawingml/2006/picture">
                 <pic:pic xmlns:pic="http://schemas.openxmlformats.org/drawingml/2006/picture">
                   <pic:nvPicPr>
-                    <pic:cNvPr id="0" name="Picture 2"/>
+                    <pic:cNvPr id="0" name="Picture 1"/>
                     <pic:cNvPicPr>
                       <a:picLocks noChangeAspect="1" noChangeArrowheads="1"/>
                     </pic:cNvPicPr>
                   </pic:nvPicPr>
                   <pic:blipFill>
-                    <a:blip r:embed="rId8" cstate="print">
+                    <a:blip r:embed="rId8">
                       <a:extLst>
                         <a:ext uri="{28A0092B-C50C-407E-A947-70E740481C1C}">
                           <a14:useLocalDpi xmlns:a14="http://schemas.microsoft.com/office/drawing/2010/main" val="0"/>
@@ -279,7 +279,7 @@
                   <pic:spPr bwMode="auto">
                     <a:xfrm>
                       <a:off x="0" y="0"/>
-                      <a:ext cx="4539113" cy="4244277"/>
+                      <a:ext cx="4843539" cy="4528781"/>
                     </a:xfrm>
                     <a:prstGeom prst="rect">
                       <a:avLst/>
@@ -355,7 +355,6 @@
                 <w:b/>
                 <w:bCs/>
               </w:rPr>
-              <w:lastRenderedPageBreak/>
               <w:t>Module</w:t>
             </w:r>
           </w:p>
@@ -497,7 +496,13 @@
               <w:rPr>
                 <w:rFonts w:ascii="Times New Roman" w:hAnsi="Times New Roman" w:cs="Times New Roman"/>
               </w:rPr>
-              <w:t>serial_communication</w:t>
+              <w:t>serial_</w:t>
+            </w:r>
+            <w:r>
+              <w:rPr>
+                <w:rFonts w:ascii="Times New Roman" w:hAnsi="Times New Roman" w:cs="Times New Roman"/>
+              </w:rPr>
+              <w:t>manager</w:t>
             </w:r>
             <w:r>
               <w:rPr>
@@ -522,7 +527,19 @@
               <w:rPr>
                 <w:rFonts w:ascii="Times New Roman" w:hAnsi="Times New Roman" w:cs="Times New Roman"/>
               </w:rPr>
-              <w:t>Handles all communication with test fixture asynchronously</w:t>
+              <w:t xml:space="preserve">Handles all </w:t>
+            </w:r>
+            <w:r>
+              <w:rPr>
+                <w:rFonts w:ascii="Times New Roman" w:hAnsi="Times New Roman" w:cs="Times New Roman"/>
+              </w:rPr>
+              <w:t xml:space="preserve">serial </w:t>
+            </w:r>
+            <w:r>
+              <w:rPr>
+                <w:rFonts w:ascii="Times New Roman" w:hAnsi="Times New Roman" w:cs="Times New Roman"/>
+              </w:rPr>
+              <w:t>communication with test fixture asynchronously</w:t>
             </w:r>
           </w:p>
         </w:tc>
@@ -1412,14 +1429,14 @@
         <w:rPr>
           <w:rFonts w:ascii="Times New Roman" w:hAnsi="Times New Roman" w:cs="Times New Roman"/>
         </w:rPr>
-        <w:t xml:space="preserve">The device module implements asynchronous communication with the virtual COM port of the IC test fixture to prevent blocking the main GUI event loop. The module also implements the data structures required to store parsed information from test scripts and the results received. </w:t>
+        <w:t xml:space="preserve">The device module implements asynchronous communication with the virtual COM port of the IC test fixture to prevent blocking the main GUI event loop. The module also implements the </w:t>
       </w:r>
       <w:r>
         <w:rPr>
           <w:rFonts w:ascii="Times New Roman" w:hAnsi="Times New Roman" w:cs="Times New Roman"/>
         </w:rPr>
         <w:lastRenderedPageBreak/>
-        <w:t>This module is used in the “Parse Test Script” step and the test script execution loop in the flowchart.</w:t>
+        <w:t>data structures required to store parsed information from test scripts and the results received. This module is used in the “Parse Test Script” step and the test script execution loop in the flowchart.</w:t>
       </w:r>
     </w:p>
     <w:p>
@@ -1612,7 +1629,7 @@
           <w:noProof/>
         </w:rPr>
         <w:drawing>
-          <wp:inline distT="0" distB="0" distL="0" distR="0" wp14:anchorId="7711B43E" wp14:editId="6068AD82">
+          <wp:inline distT="0" distB="0" distL="0" distR="0" wp14:anchorId="7711B43E" wp14:editId="7AE32208">
             <wp:extent cx="5929630" cy="3181350"/>
             <wp:effectExtent l="0" t="0" r="0" b="0"/>
             <wp:docPr id="1310520674" name="Picture 3"/>
@@ -1731,21 +1748,27 @@
         <w:rPr>
           <w:rFonts w:ascii="Times New Roman" w:hAnsi="Times New Roman" w:cs="Times New Roman"/>
         </w:rPr>
-        <w:t xml:space="preserve"> will read the test script and create a dictionary with keys and values being proper Python data types. The parsing algorithm manually checks that the data is within the hardware’s capabilities and is a valid argument.</w:t>
-      </w:r>
-    </w:p>
-    <w:p>
-      <w:pPr>
-        <w:spacing w:line="276" w:lineRule="auto"/>
-        <w:rPr>
-          <w:rFonts w:ascii="Times New Roman" w:hAnsi="Times New Roman" w:cs="Times New Roman"/>
-        </w:rPr>
-      </w:pPr>
+        <w:t xml:space="preserve"> will read the test script and create a dictionary with </w:t>
+      </w:r>
       <w:r>
         <w:rPr>
           <w:rFonts w:ascii="Times New Roman" w:hAnsi="Times New Roman" w:cs="Times New Roman"/>
         </w:rPr>
         <w:lastRenderedPageBreak/>
+        <w:t>keys and values being proper Python data types. The parsing algorithm manually checks that the data is within the hardware’s capabilities and is a valid argument.</w:t>
+      </w:r>
+    </w:p>
+    <w:p>
+      <w:pPr>
+        <w:spacing w:line="276" w:lineRule="auto"/>
+        <w:rPr>
+          <w:rFonts w:ascii="Times New Roman" w:hAnsi="Times New Roman" w:cs="Times New Roman"/>
+        </w:rPr>
+      </w:pPr>
+      <w:r>
+        <w:rPr>
+          <w:rFonts w:ascii="Times New Roman" w:hAnsi="Times New Roman" w:cs="Times New Roman"/>
+        </w:rPr>
         <w:t>At the top of the file are the global macros used by the parsing algorithm. These variables provide the expected logic, voltage levels, and maximum pins the hardware can support. They are implemented as sets for constant lookup times.</w:t>
       </w:r>
     </w:p>
@@ -4139,7 +4162,7 @@
         </w:rPr>
         <w:lastRenderedPageBreak/>
         <w:drawing>
-          <wp:inline distT="0" distB="0" distL="0" distR="0" wp14:anchorId="34397260" wp14:editId="4221F051">
+          <wp:inline distT="0" distB="0" distL="0" distR="0" wp14:anchorId="34397260" wp14:editId="4AA36EEC">
             <wp:extent cx="5368854" cy="4572000"/>
             <wp:effectExtent l="0" t="0" r="3810" b="0"/>
             <wp:docPr id="1635896170" name="Picture 2"/>
@@ -4425,7 +4448,7 @@
           <w:szCs w:val="28"/>
         </w:rPr>
         <w:drawing>
-          <wp:inline distT="0" distB="0" distL="0" distR="0" wp14:anchorId="70F40ADF" wp14:editId="2B869240">
+          <wp:inline distT="0" distB="0" distL="0" distR="0" wp14:anchorId="70F40ADF" wp14:editId="31E57417">
             <wp:extent cx="5939155" cy="4662805"/>
             <wp:effectExtent l="0" t="0" r="4445" b="4445"/>
             <wp:docPr id="478163762" name="Picture 1"/>
@@ -7860,14 +7883,6 @@
 </file>
 
 <file path=customXml/item1.xml><?xml version="1.0" encoding="utf-8"?>
-<p:properties xmlns:p="http://schemas.microsoft.com/office/2006/metadata/properties" xmlns:xsi="http://www.w3.org/2001/XMLSchema-instance" xmlns:pc="http://schemas.microsoft.com/office/infopath/2007/PartnerControls">
-  <documentManagement>
-    <_activity xmlns="90d77c43-296a-4b3f-9e49-e5a41fa612db" xsi:nil="true"/>
-  </documentManagement>
-</p:properties>
-</file>
-
-<file path=customXml/item2.xml><?xml version="1.0" encoding="utf-8"?>
 <ct:contentTypeSchema xmlns:ct="http://schemas.microsoft.com/office/2006/metadata/contentType" xmlns:ma="http://schemas.microsoft.com/office/2006/metadata/properties/metaAttributes" ct:_="" ma:_="" ma:contentTypeName="Document" ma:contentTypeID="0x010100E3213E7FCD12C842BD6D52020923FEE7" ma:contentTypeVersion="15" ma:contentTypeDescription="Create a new document." ma:contentTypeScope="" ma:versionID="6d3b405af1beb79a866757960a22950a">
   <xsd:schema xmlns:xsd="http://www.w3.org/2001/XMLSchema" xmlns:xs="http://www.w3.org/2001/XMLSchema" xmlns:p="http://schemas.microsoft.com/office/2006/metadata/properties" xmlns:ns3="90d77c43-296a-4b3f-9e49-e5a41fa612db" xmlns:ns4="e753585f-8e3a-40e2-9fca-7f6a4bd74cca" targetNamespace="http://schemas.microsoft.com/office/2006/metadata/properties" ma:root="true" ma:fieldsID="becdc901ebd396f3014e96f51bd0d99a" ns3:_="" ns4:_="">
     <xsd:import namespace="90d77c43-296a-4b3f-9e49-e5a41fa612db"/>
@@ -8100,6 +8115,14 @@
 </ct:contentTypeSchema>
 </file>
 
+<file path=customXml/item2.xml><?xml version="1.0" encoding="utf-8"?>
+<p:properties xmlns:p="http://schemas.microsoft.com/office/2006/metadata/properties" xmlns:xsi="http://www.w3.org/2001/XMLSchema-instance" xmlns:pc="http://schemas.microsoft.com/office/infopath/2007/PartnerControls">
+  <documentManagement>
+    <_activity xmlns="90d77c43-296a-4b3f-9e49-e5a41fa612db" xsi:nil="true"/>
+  </documentManagement>
+</p:properties>
+</file>
+
 <file path=customXml/item3.xml><?xml version="1.0" encoding="utf-8"?>
 <?mso-contentType ?>
 <FormTemplates xmlns="http://schemas.microsoft.com/sharepoint/v3/contenttype/forms">
@@ -8110,16 +8133,6 @@
 </file>
 
 <file path=customXml/itemProps1.xml><?xml version="1.0" encoding="utf-8"?>
-<ds:datastoreItem xmlns:ds="http://schemas.openxmlformats.org/officeDocument/2006/customXml" ds:itemID="{705B0F98-4BED-42C6-BA5B-C0EA65C9A013}">
-  <ds:schemaRefs>
-    <ds:schemaRef ds:uri="http://schemas.microsoft.com/office/2006/metadata/properties"/>
-    <ds:schemaRef ds:uri="http://schemas.microsoft.com/office/infopath/2007/PartnerControls"/>
-    <ds:schemaRef ds:uri="90d77c43-296a-4b3f-9e49-e5a41fa612db"/>
-  </ds:schemaRefs>
-</ds:datastoreItem>
-</file>
-
-<file path=customXml/itemProps2.xml><?xml version="1.0" encoding="utf-8"?>
 <ds:datastoreItem xmlns:ds="http://schemas.openxmlformats.org/officeDocument/2006/customXml" ds:itemID="{827888A1-2862-4278-B896-5F4D5930CACC}">
   <ds:schemaRefs>
     <ds:schemaRef ds:uri="http://schemas.microsoft.com/office/2006/metadata/contentType"/>
@@ -8138,6 +8151,16 @@
 </ds:datastoreItem>
 </file>
 
+<file path=customXml/itemProps2.xml><?xml version="1.0" encoding="utf-8"?>
+<ds:datastoreItem xmlns:ds="http://schemas.openxmlformats.org/officeDocument/2006/customXml" ds:itemID="{705B0F98-4BED-42C6-BA5B-C0EA65C9A013}">
+  <ds:schemaRefs>
+    <ds:schemaRef ds:uri="http://schemas.microsoft.com/office/2006/metadata/properties"/>
+    <ds:schemaRef ds:uri="http://schemas.microsoft.com/office/infopath/2007/PartnerControls"/>
+    <ds:schemaRef ds:uri="90d77c43-296a-4b3f-9e49-e5a41fa612db"/>
+  </ds:schemaRefs>
+</ds:datastoreItem>
+</file>
+
 <file path=customXml/itemProps3.xml><?xml version="1.0" encoding="utf-8"?>
 <ds:datastoreItem xmlns:ds="http://schemas.openxmlformats.org/officeDocument/2006/customXml" ds:itemID="{375D1BB5-FF7A-4425-A331-134E7D149F6D}">
   <ds:schemaRefs>

</xml_diff>

<commit_message>
finalized software readme, and toplevel readme
</commit_message>
<xml_diff>
--- a/docs/editable/Python Technical Documentation.docx
+++ b/docs/editable/Python Technical Documentation.docx
@@ -957,21 +957,7 @@
               <w:rPr>
                 <w:rFonts w:ascii="Times New Roman" w:hAnsi="Times New Roman" w:cs="Times New Roman"/>
               </w:rPr>
-              <w:t xml:space="preserve">integrates all </w:t>
-            </w:r>
-            <w:proofErr w:type="gramStart"/>
-            <w:r>
-              <w:rPr>
-                <w:rFonts w:ascii="Times New Roman" w:hAnsi="Times New Roman" w:cs="Times New Roman"/>
-              </w:rPr>
-              <w:t>portion</w:t>
-            </w:r>
-            <w:proofErr w:type="gramEnd"/>
-            <w:r>
-              <w:rPr>
-                <w:rFonts w:ascii="Times New Roman" w:hAnsi="Times New Roman" w:cs="Times New Roman"/>
-              </w:rPr>
-              <w:t xml:space="preserve"> of the Python code together</w:t>
+              <w:t>integrates all portion of the Python code together</w:t>
             </w:r>
           </w:p>
         </w:tc>
@@ -1629,7 +1615,7 @@
           <w:noProof/>
         </w:rPr>
         <w:drawing>
-          <wp:inline distT="0" distB="0" distL="0" distR="0" wp14:anchorId="7711B43E" wp14:editId="7AE32208">
+          <wp:inline distT="0" distB="0" distL="0" distR="0" wp14:anchorId="7711B43E" wp14:editId="67BBB708">
             <wp:extent cx="5929630" cy="3181350"/>
             <wp:effectExtent l="0" t="0" r="0" b="0"/>
             <wp:docPr id="1310520674" name="Picture 3"/>
@@ -1923,35 +1909,7 @@
         <w:rPr>
           <w:rFonts w:ascii="Times New Roman" w:hAnsi="Times New Roman" w:cs="Times New Roman"/>
         </w:rPr>
-        <w:t xml:space="preserve"> performs all the low-level parsing, creating a dictionary with all values converted to valid data types, such as int, float, string, or list. Since the data is a dictionary, parsing can easily be accomplished by directly accessing parameters by their designated key in the test script. For example, </w:t>
-      </w:r>
-      <w:proofErr w:type="gramStart"/>
-      <w:r>
-        <w:rPr>
-          <w:rFonts w:ascii="Times New Roman" w:hAnsi="Times New Roman" w:cs="Times New Roman"/>
-        </w:rPr>
-        <w:t>data[</w:t>
-      </w:r>
-      <w:proofErr w:type="gramEnd"/>
-      <w:r>
-        <w:rPr>
-          <w:rFonts w:ascii="Times New Roman" w:hAnsi="Times New Roman" w:cs="Times New Roman"/>
-        </w:rPr>
-        <w:t>“Global Parameters</w:t>
-      </w:r>
-      <w:proofErr w:type="gramStart"/>
-      <w:r>
-        <w:rPr>
-          <w:rFonts w:ascii="Times New Roman" w:hAnsi="Times New Roman" w:cs="Times New Roman"/>
-        </w:rPr>
-        <w:t>”][</w:t>
-      </w:r>
-      <w:proofErr w:type="gramEnd"/>
-      <w:r>
-        <w:rPr>
-          <w:rFonts w:ascii="Times New Roman" w:hAnsi="Times New Roman" w:cs="Times New Roman"/>
-        </w:rPr>
-        <w:t>“VCC Pin”] accesses the VCC Pin. Then the VCC Pin can be determined if the pin value provided is valid. There is a function dedicated to parsing each section of the test script. This is done for modularity if more sections are added to the test script in the future. The current parsing order is “Global Parameters,” “Pin Map,” “Truth Table,” and “Tests.”</w:t>
+        <w:t xml:space="preserve"> performs all the low-level parsing, creating a dictionary with all values converted to valid data types, such as int, float, string, or list. Since the data is a dictionary, parsing can easily be accomplished by directly accessing parameters by their designated key in the test script. For example, data[“Global Parameters”][“VCC Pin”] accesses the VCC Pin. Then the VCC Pin can be determined if the pin value provided is valid. There is a function dedicated to parsing each section of the test script. This is done for modularity if more sections are added to the test script in the future. The current parsing order is “Global Parameters,” “Pin Map,” “Truth Table,” and “Tests.”</w:t>
       </w:r>
     </w:p>
     <w:p>
@@ -2861,21 +2819,7 @@
         <w:rPr>
           <w:rFonts w:ascii="Times New Roman" w:hAnsi="Times New Roman" w:cs="Times New Roman"/>
         </w:rPr>
-        <w:t xml:space="preserve">” function generates the contents and builds the PDF report. The list variable story is </w:t>
-      </w:r>
-      <w:proofErr w:type="gramStart"/>
-      <w:r>
-        <w:rPr>
-          <w:rFonts w:ascii="Times New Roman" w:hAnsi="Times New Roman" w:cs="Times New Roman"/>
-        </w:rPr>
-        <w:t>all of</w:t>
-      </w:r>
-      <w:proofErr w:type="gramEnd"/>
-      <w:r>
-        <w:rPr>
-          <w:rFonts w:ascii="Times New Roman" w:hAnsi="Times New Roman" w:cs="Times New Roman"/>
-        </w:rPr>
-        <w:t xml:space="preserve"> the contents to be displayed in the PDF report. The platypus module will display </w:t>
+        <w:t xml:space="preserve">” function generates the contents and builds the PDF report. The list variable story is all of the contents to be displayed in the PDF report. The platypus module will display </w:t>
       </w:r>
       <w:r>
         <w:rPr>
@@ -3611,49 +3555,21 @@
           <w:rFonts w:ascii="Times New Roman" w:hAnsi="Times New Roman" w:cs="Times New Roman"/>
         </w:rPr>
         <w:lastRenderedPageBreak/>
-        <w:t xml:space="preserve">represents a row of data, which is represented by strings. The table includes headers and empty cells (created by empty strings, “”). The empty cells are used when the data in cells </w:t>
-      </w:r>
-      <w:proofErr w:type="gramStart"/>
-      <w:r>
-        <w:rPr>
-          <w:rFonts w:ascii="Times New Roman" w:hAnsi="Times New Roman" w:cs="Times New Roman"/>
-        </w:rPr>
-        <w:t>needs</w:t>
-      </w:r>
-      <w:proofErr w:type="gramEnd"/>
-      <w:r>
-        <w:rPr>
-          <w:rFonts w:ascii="Times New Roman" w:hAnsi="Times New Roman" w:cs="Times New Roman"/>
-        </w:rPr>
-        <w:t xml:space="preserve"> to span multiple rows or columns. It does not matter where the data is for spanning, but it is recommended to be stored in the left and top-most cells, as the metadata of the table assumes this logic. Unlike input pins that may share columns, the output pins are unraveled from the lists and receive their own columns. This allows the results of each pin to have their own cell to enhance the readability of the table. If a test has multiple test conditions, the VCC column is included, it is omitted. If the VCC column is included, the expected result cells are subdivided to match the number of different test conditions.</w:t>
-      </w:r>
-    </w:p>
-    <w:p>
-      <w:pPr>
-        <w:spacing w:line="276" w:lineRule="auto"/>
-        <w:rPr>
-          <w:rFonts w:ascii="Times New Roman" w:hAnsi="Times New Roman" w:cs="Times New Roman"/>
-        </w:rPr>
-      </w:pPr>
-      <w:r>
-        <w:rPr>
-          <w:rFonts w:ascii="Times New Roman" w:hAnsi="Times New Roman" w:cs="Times New Roman"/>
-        </w:rPr>
-        <w:t xml:space="preserve">The metadata of the table is used for formatting the table in the PDF report, specifically </w:t>
-      </w:r>
-      <w:proofErr w:type="gramStart"/>
-      <w:r>
-        <w:rPr>
-          <w:rFonts w:ascii="Times New Roman" w:hAnsi="Times New Roman" w:cs="Times New Roman"/>
-        </w:rPr>
-        <w:t>indicating to</w:t>
-      </w:r>
-      <w:proofErr w:type="gramEnd"/>
-      <w:r>
-        <w:rPr>
-          <w:rFonts w:ascii="Times New Roman" w:hAnsi="Times New Roman" w:cs="Times New Roman"/>
-        </w:rPr>
-        <w:t xml:space="preserve"> </w:t>
+        <w:t>represents a row of data, which is represented by strings. The table includes headers and empty cells (created by empty strings, “”). The empty cells are used when the data in cells needs to span multiple rows or columns. It does not matter where the data is for spanning, but it is recommended to be stored in the left and top-most cells, as the metadata of the table assumes this logic. Unlike input pins that may share columns, the output pins are unraveled from the lists and receive their own columns. This allows the results of each pin to have their own cell to enhance the readability of the table. If a test has multiple test conditions, the VCC column is included, it is omitted. If the VCC column is included, the expected result cells are subdivided to match the number of different test conditions.</w:t>
+      </w:r>
+    </w:p>
+    <w:p>
+      <w:pPr>
+        <w:spacing w:line="276" w:lineRule="auto"/>
+        <w:rPr>
+          <w:rFonts w:ascii="Times New Roman" w:hAnsi="Times New Roman" w:cs="Times New Roman"/>
+        </w:rPr>
+      </w:pPr>
+      <w:r>
+        <w:rPr>
+          <w:rFonts w:ascii="Times New Roman" w:hAnsi="Times New Roman" w:cs="Times New Roman"/>
+        </w:rPr>
+        <w:t xml:space="preserve">The metadata of the table is used for formatting the table in the PDF report, specifically indicating to </w:t>
       </w:r>
       <w:proofErr w:type="spellStart"/>
       <w:r>
@@ -3751,21 +3667,7 @@
         <w:rPr>
           <w:rFonts w:ascii="Times New Roman" w:hAnsi="Times New Roman" w:cs="Times New Roman"/>
         </w:rPr>
-        <w:t xml:space="preserve"> represents the number of </w:t>
-      </w:r>
-      <w:proofErr w:type="gramStart"/>
-      <w:r>
-        <w:rPr>
-          <w:rFonts w:ascii="Times New Roman" w:hAnsi="Times New Roman" w:cs="Times New Roman"/>
-        </w:rPr>
-        <w:t>input</w:t>
-      </w:r>
-      <w:proofErr w:type="gramEnd"/>
-      <w:r>
-        <w:rPr>
-          <w:rFonts w:ascii="Times New Roman" w:hAnsi="Times New Roman" w:cs="Times New Roman"/>
-        </w:rPr>
-        <w:t xml:space="preserve"> </w:t>
+        <w:t xml:space="preserve"> represents the number of input </w:t>
       </w:r>
       <w:proofErr w:type="spellStart"/>
       <w:r>
@@ -3983,7 +3885,6 @@
         <w:t xml:space="preserve"> is the recommended template to implement different types of communication protocols. </w:t>
       </w:r>
       <w:proofErr w:type="spellStart"/>
-      <w:proofErr w:type="gramStart"/>
       <w:r>
         <w:rPr>
           <w:rFonts w:ascii="Times New Roman" w:hAnsi="Times New Roman" w:cs="Times New Roman"/>
@@ -3997,7 +3898,6 @@
         <w:t>Manager</w:t>
       </w:r>
       <w:proofErr w:type="spellEnd"/>
-      <w:proofErr w:type="gramEnd"/>
       <w:r>
         <w:rPr>
           <w:rFonts w:ascii="Times New Roman" w:hAnsi="Times New Roman" w:cs="Times New Roman"/>
@@ -4068,21 +3968,7 @@
         <w:rPr>
           <w:rFonts w:ascii="Times New Roman" w:hAnsi="Times New Roman" w:cs="Times New Roman"/>
         </w:rPr>
-        <w:t xml:space="preserve"> maintains a buffer for all responses received by the test </w:t>
-      </w:r>
-      <w:proofErr w:type="gramStart"/>
-      <w:r>
-        <w:rPr>
-          <w:rFonts w:ascii="Times New Roman" w:hAnsi="Times New Roman" w:cs="Times New Roman"/>
-        </w:rPr>
-        <w:t>fixture, and</w:t>
-      </w:r>
-      <w:proofErr w:type="gramEnd"/>
-      <w:r>
-        <w:rPr>
-          <w:rFonts w:ascii="Times New Roman" w:hAnsi="Times New Roman" w:cs="Times New Roman"/>
-        </w:rPr>
-        <w:t xml:space="preserve"> keeps track of the current active protocol. </w:t>
+        <w:t xml:space="preserve"> maintains a buffer for all responses received by the test fixture, and keeps track of the current active protocol. </w:t>
       </w:r>
     </w:p>
     <w:p>
@@ -4162,10 +4048,10 @@
         </w:rPr>
         <w:lastRenderedPageBreak/>
         <w:drawing>
-          <wp:inline distT="0" distB="0" distL="0" distR="0" wp14:anchorId="34397260" wp14:editId="4AA36EEC">
-            <wp:extent cx="5368854" cy="4572000"/>
-            <wp:effectExtent l="0" t="0" r="3810" b="0"/>
-            <wp:docPr id="1635896170" name="Picture 2"/>
+          <wp:inline distT="0" distB="0" distL="0" distR="0" wp14:anchorId="215C9D87" wp14:editId="745B2588">
+            <wp:extent cx="5798674" cy="4691063"/>
+            <wp:effectExtent l="0" t="0" r="0" b="0"/>
+            <wp:docPr id="2057373253" name="Picture 1"/>
             <wp:cNvGraphicFramePr>
               <a:graphicFrameLocks xmlns:a="http://schemas.openxmlformats.org/drawingml/2006/main" noChangeAspect="1"/>
             </wp:cNvGraphicFramePr>
@@ -4173,7 +4059,7 @@
               <a:graphicData uri="http://schemas.openxmlformats.org/drawingml/2006/picture">
                 <pic:pic xmlns:pic="http://schemas.openxmlformats.org/drawingml/2006/picture">
                   <pic:nvPicPr>
-                    <pic:cNvPr id="0" name="Picture 2"/>
+                    <pic:cNvPr id="0" name="Picture 1"/>
                     <pic:cNvPicPr>
                       <a:picLocks noChangeAspect="1" noChangeArrowheads="1"/>
                     </pic:cNvPicPr>
@@ -4194,7 +4080,7 @@
                   <pic:spPr bwMode="auto">
                     <a:xfrm>
                       <a:off x="0" y="0"/>
-                      <a:ext cx="5371207" cy="4574004"/>
+                      <a:ext cx="5813143" cy="4702768"/>
                     </a:xfrm>
                     <a:prstGeom prst="rect">
                       <a:avLst/>
@@ -4227,7 +4113,23 @@
           <w:i/>
           <w:iCs/>
         </w:rPr>
-        <w:t>Figure 8: Basic layout of serial_communication.py</w:t>
+        <w:t>Figure 8: Basic layout of serial_</w:t>
+      </w:r>
+      <w:r>
+        <w:rPr>
+          <w:rFonts w:ascii="Times New Roman" w:hAnsi="Times New Roman" w:cs="Times New Roman"/>
+          <w:i/>
+          <w:iCs/>
+        </w:rPr>
+        <w:t>manager</w:t>
+      </w:r>
+      <w:r>
+        <w:rPr>
+          <w:rFonts w:ascii="Times New Roman" w:hAnsi="Times New Roman" w:cs="Times New Roman"/>
+          <w:i/>
+          <w:iCs/>
+        </w:rPr>
+        <w:t>.py</w:t>
       </w:r>
     </w:p>
     <w:p>
@@ -4448,10 +4350,10 @@
           <w:szCs w:val="28"/>
         </w:rPr>
         <w:drawing>
-          <wp:inline distT="0" distB="0" distL="0" distR="0" wp14:anchorId="70F40ADF" wp14:editId="31E57417">
-            <wp:extent cx="5939155" cy="4662805"/>
+          <wp:inline distT="0" distB="0" distL="0" distR="0" wp14:anchorId="2DBB417B" wp14:editId="72F677B4">
+            <wp:extent cx="5939155" cy="4758055"/>
             <wp:effectExtent l="0" t="0" r="4445" b="4445"/>
-            <wp:docPr id="478163762" name="Picture 1"/>
+            <wp:docPr id="1998539306" name="Picture 2"/>
             <wp:cNvGraphicFramePr>
               <a:graphicFrameLocks xmlns:a="http://schemas.openxmlformats.org/drawingml/2006/main" noChangeAspect="1"/>
             </wp:cNvGraphicFramePr>
@@ -4459,7 +4361,7 @@
               <a:graphicData uri="http://schemas.openxmlformats.org/drawingml/2006/picture">
                 <pic:pic xmlns:pic="http://schemas.openxmlformats.org/drawingml/2006/picture">
                   <pic:nvPicPr>
-                    <pic:cNvPr id="0" name="Picture 1"/>
+                    <pic:cNvPr id="0" name="Picture 2"/>
                     <pic:cNvPicPr>
                       <a:picLocks noChangeAspect="1" noChangeArrowheads="1"/>
                     </pic:cNvPicPr>
@@ -4480,7 +4382,7 @@
                   <pic:spPr bwMode="auto">
                     <a:xfrm>
                       <a:off x="0" y="0"/>
-                      <a:ext cx="5939155" cy="4662805"/>
+                      <a:ext cx="5939155" cy="4758055"/>
                     </a:xfrm>
                     <a:prstGeom prst="rect">
                       <a:avLst/>
@@ -4523,16 +4425,14 @@
         </w:rPr>
         <w:t xml:space="preserve">High level overview of the application and </w:t>
       </w:r>
-      <w:proofErr w:type="gramStart"/>
       <w:r>
         <w:rPr>
           <w:rFonts w:ascii="Times New Roman" w:hAnsi="Times New Roman" w:cs="Times New Roman"/>
           <w:i/>
           <w:iCs/>
         </w:rPr>
-        <w:t>is</w:t>
-      </w:r>
-      <w:proofErr w:type="gramEnd"/>
+        <w:t>the</w:t>
+      </w:r>
       <w:r>
         <w:rPr>
           <w:rFonts w:ascii="Times New Roman" w:hAnsi="Times New Roman" w:cs="Times New Roman"/>
@@ -4665,6 +4565,7 @@
         <w:rPr>
           <w:rFonts w:ascii="Times New Roman" w:hAnsi="Times New Roman" w:cs="Times New Roman"/>
         </w:rPr>
+        <w:lastRenderedPageBreak/>
         <w:t xml:space="preserve">The main window offers basic text editor support, like </w:t>
       </w:r>
       <w:proofErr w:type="spellStart"/>
@@ -4686,7 +4587,6 @@
         <w:rPr>
           <w:rFonts w:ascii="Times New Roman" w:hAnsi="Times New Roman" w:cs="Times New Roman"/>
         </w:rPr>
-        <w:lastRenderedPageBreak/>
         <w:t>QTextEdit</w:t>
       </w:r>
       <w:proofErr w:type="spellEnd"/>
@@ -4708,21 +4608,7 @@
         <w:rPr>
           <w:rFonts w:ascii="Times New Roman" w:hAnsi="Times New Roman" w:cs="Times New Roman"/>
         </w:rPr>
-        <w:t xml:space="preserve">To execute test scripts, or send commands to </w:t>
-      </w:r>
-      <w:proofErr w:type="gramStart"/>
-      <w:r>
-        <w:rPr>
-          <w:rFonts w:ascii="Times New Roman" w:hAnsi="Times New Roman" w:cs="Times New Roman"/>
-        </w:rPr>
-        <w:t>the STM32</w:t>
-      </w:r>
-      <w:proofErr w:type="gramEnd"/>
-      <w:r>
-        <w:rPr>
-          <w:rFonts w:ascii="Times New Roman" w:hAnsi="Times New Roman" w:cs="Times New Roman"/>
-        </w:rPr>
-        <w:t xml:space="preserve">, functions should be connected to buttons of the run menu. These functions should create </w:t>
+        <w:t xml:space="preserve">To execute test scripts, or send commands to the STM32, functions should be connected to buttons of the run menu. These functions should create </w:t>
       </w:r>
       <w:r>
         <w:rPr>
@@ -4833,6 +4719,20 @@
           <w:rFonts w:ascii="Times New Roman" w:hAnsi="Times New Roman" w:cs="Times New Roman"/>
         </w:rPr>
         <w:t>This file will create instances of any objects that are required during the application’s runtime and include any default settings. Currently, it dynamically finds the serial port by searching for the CP2102 USB-to-UART bridge information (VID: 0x10C4, PID: 0xEA60), with the serial number 554D4C2043617073746F6E652032352D333034204E5557432032303236.</w:t>
+      </w:r>
+    </w:p>
+    <w:p>
+      <w:pPr>
+        <w:spacing w:line="276" w:lineRule="auto"/>
+        <w:rPr>
+          <w:rFonts w:ascii="Times New Roman" w:hAnsi="Times New Roman" w:cs="Times New Roman"/>
+        </w:rPr>
+      </w:pPr>
+      <w:r>
+        <w:rPr>
+          <w:rFonts w:ascii="Times New Roman" w:hAnsi="Times New Roman" w:cs="Times New Roman"/>
+        </w:rPr>
+        <w:t xml:space="preserve">Not shown in Figure 9, on startup, the application will first do a SHA-256 checksum for the executable application and raise a warning to the user if the checksum does not match the expected value. The expected checksum is stored as the last 32-bytes of the executable and calculated using every byte of the executable excluding the last 32-bytes. This checksum is appended during the building of the application. This will only apply for the compiled executable and not during development. After that, the GUI will open the serial port and execute the checksum command for the STM32. If the checksum received by the STM32 does not match EXEPECTED_CHECKSUM, a warning will be raised similar to the application’s checksum. </w:t>
       </w:r>
     </w:p>
     <w:p>
@@ -5078,6 +4978,7 @@
           <w:sz w:val="28"/>
           <w:szCs w:val="28"/>
         </w:rPr>
+        <w:lastRenderedPageBreak/>
         <w:t>Test Script Wizard</w:t>
       </w:r>
     </w:p>
@@ -5176,7 +5077,6 @@
         <w:rPr>
           <w:rFonts w:ascii="Times New Roman" w:hAnsi="Times New Roman" w:cs="Times New Roman"/>
         </w:rPr>
-        <w:lastRenderedPageBreak/>
         <w:t xml:space="preserve">Every page of the widget derives from the </w:t>
       </w:r>
       <w:proofErr w:type="spellStart"/>
@@ -5205,21 +5105,7 @@
         <w:rPr>
           <w:rFonts w:ascii="Times New Roman" w:hAnsi="Times New Roman" w:cs="Times New Roman"/>
         </w:rPr>
-        <w:t xml:space="preserve">” function. The function returns </w:t>
-      </w:r>
-      <w:proofErr w:type="gramStart"/>
-      <w:r>
-        <w:rPr>
-          <w:rFonts w:ascii="Times New Roman" w:hAnsi="Times New Roman" w:cs="Times New Roman"/>
-        </w:rPr>
-        <w:t>a Boolean</w:t>
-      </w:r>
-      <w:proofErr w:type="gramEnd"/>
-      <w:r>
-        <w:rPr>
-          <w:rFonts w:ascii="Times New Roman" w:hAnsi="Times New Roman" w:cs="Times New Roman"/>
-        </w:rPr>
-        <w:t xml:space="preserve">; if false, it will prevent the user from moving onto the next page. The function will extract the data from the entries the user provided into the expected structure that the parsing algorithm expects. The page’s respective “parse” function is called for validation. The order of the pages is the same order as the parsing algorithm’s order. To share information between the pages, as some parsing functions are dependent on other portions, </w:t>
+        <w:t xml:space="preserve">” function. The function returns a Boolean; if false, it will prevent the user from moving onto the next page. The function will extract the data from the entries the user provided into the expected structure that the parsing algorithm expects. The page’s respective “parse” function is called for validation. The order of the pages is the same order as the parsing algorithm’s order. To share information between the pages, as some parsing functions are dependent on other portions, </w:t>
       </w:r>
       <w:proofErr w:type="spellStart"/>
       <w:r>
@@ -5233,21 +5119,7 @@
         <w:rPr>
           <w:rFonts w:ascii="Times New Roman" w:hAnsi="Times New Roman" w:cs="Times New Roman"/>
         </w:rPr>
-        <w:t xml:space="preserve"> contains a dictionary that is accessible via </w:t>
-      </w:r>
-      <w:proofErr w:type="gramStart"/>
-      <w:r>
-        <w:rPr>
-          <w:rFonts w:ascii="Times New Roman" w:hAnsi="Times New Roman" w:cs="Times New Roman"/>
-        </w:rPr>
-        <w:t>wizard(</w:t>
-      </w:r>
-      <w:proofErr w:type="gramEnd"/>
-      <w:r>
-        <w:rPr>
-          <w:rFonts w:ascii="Times New Roman" w:hAnsi="Times New Roman" w:cs="Times New Roman"/>
-        </w:rPr>
-        <w:t xml:space="preserve">).data in the pages. The page numbers are located near the top of the file as an enumerated type named </w:t>
+        <w:t xml:space="preserve"> contains a dictionary that is accessible via wizard().data in the pages. The page numbers are located near the top of the file as an enumerated type named </w:t>
       </w:r>
       <w:proofErr w:type="spellStart"/>
       <w:r>
@@ -5398,7 +5270,6 @@
         <w:t xml:space="preserve">. </w:t>
       </w:r>
       <w:proofErr w:type="spellStart"/>
-      <w:proofErr w:type="gramStart"/>
       <w:r>
         <w:rPr>
           <w:rFonts w:ascii="Times New Roman" w:hAnsi="Times New Roman" w:cs="Times New Roman"/>
@@ -5406,7 +5277,6 @@
         <w:t>DynamicContainer</w:t>
       </w:r>
       <w:proofErr w:type="spellEnd"/>
-      <w:proofErr w:type="gramEnd"/>
       <w:r>
         <w:rPr>
           <w:rFonts w:ascii="Times New Roman" w:hAnsi="Times New Roman" w:cs="Times New Roman"/>
@@ -5532,7 +5402,14 @@
         <w:rPr>
           <w:rFonts w:ascii="Times New Roman" w:hAnsi="Times New Roman" w:cs="Times New Roman"/>
         </w:rPr>
-        <w:t xml:space="preserve"> library. It is highly recommended to run these unit tests after making changes to test scripts or source code to ensure everything works as expected.</w:t>
+        <w:t xml:space="preserve"> </w:t>
+      </w:r>
+      <w:r>
+        <w:rPr>
+          <w:rFonts w:ascii="Times New Roman" w:hAnsi="Times New Roman" w:cs="Times New Roman"/>
+        </w:rPr>
+        <w:lastRenderedPageBreak/>
+        <w:t>library. It is highly recommended to run these unit tests after making changes to test scripts or source code to ensure everything works as expected.</w:t>
       </w:r>
       <w:r>
         <w:rPr>
@@ -5552,35 +5429,7 @@
         <w:rPr>
           <w:rFonts w:ascii="Times New Roman" w:hAnsi="Times New Roman" w:cs="Times New Roman"/>
         </w:rPr>
-        <w:t xml:space="preserve">Test classes organize related tests together; for example, the parsing functions have many different conditions where errors are raised. Additionally, using the </w:t>
-      </w:r>
-      <w:proofErr w:type="gramStart"/>
-      <w:r>
-        <w:rPr>
-          <w:rFonts w:ascii="Times New Roman" w:hAnsi="Times New Roman" w:cs="Times New Roman"/>
-        </w:rPr>
-        <w:t>“::</w:t>
-      </w:r>
-      <w:proofErr w:type="gramEnd"/>
-      <w:r>
-        <w:rPr>
-          <w:rFonts w:ascii="Times New Roman" w:hAnsi="Times New Roman" w:cs="Times New Roman"/>
-        </w:rPr>
-        <w:t xml:space="preserve">” operator allows developers to run a specific group of tests if it’s unnecessary to run </w:t>
-      </w:r>
-      <w:proofErr w:type="gramStart"/>
-      <w:r>
-        <w:rPr>
-          <w:rFonts w:ascii="Times New Roman" w:hAnsi="Times New Roman" w:cs="Times New Roman"/>
-        </w:rPr>
-        <w:t>all of</w:t>
-      </w:r>
-      <w:proofErr w:type="gramEnd"/>
-      <w:r>
-        <w:rPr>
-          <w:rFonts w:ascii="Times New Roman" w:hAnsi="Times New Roman" w:cs="Times New Roman"/>
-        </w:rPr>
-        <w:t xml:space="preserve"> the unit tests. The two primary decorators used from the </w:t>
+        <w:t xml:space="preserve">Test classes organize related tests together; for example, the parsing functions have many different conditions where errors are raised. Additionally, using the “::” operator allows developers to run a specific group of tests if it’s unnecessary to run all of the unit tests. The two primary decorators used from the </w:t>
       </w:r>
       <w:proofErr w:type="spellStart"/>
       <w:r>
@@ -5597,7 +5446,6 @@
         <w:t xml:space="preserve"> library are “</w:t>
       </w:r>
       <w:proofErr w:type="spellStart"/>
-      <w:proofErr w:type="gramStart"/>
       <w:r>
         <w:rPr>
           <w:rFonts w:ascii="Times New Roman" w:hAnsi="Times New Roman" w:cs="Times New Roman"/>
@@ -5605,7 +5453,6 @@
         <w:t>pytest.fixture</w:t>
       </w:r>
       <w:proofErr w:type="spellEnd"/>
-      <w:proofErr w:type="gramEnd"/>
       <w:r>
         <w:rPr>
           <w:rFonts w:ascii="Times New Roman" w:hAnsi="Times New Roman" w:cs="Times New Roman"/>
@@ -5613,19 +5460,11 @@
         <w:t>,” and “</w:t>
       </w:r>
       <w:proofErr w:type="spellStart"/>
-      <w:proofErr w:type="gramStart"/>
-      <w:r>
-        <w:rPr>
-          <w:rFonts w:ascii="Times New Roman" w:hAnsi="Times New Roman" w:cs="Times New Roman"/>
-        </w:rPr>
-        <w:t>pytest.mark</w:t>
-      </w:r>
-      <w:proofErr w:type="gramEnd"/>
-      <w:r>
-        <w:rPr>
-          <w:rFonts w:ascii="Times New Roman" w:hAnsi="Times New Roman" w:cs="Times New Roman"/>
-        </w:rPr>
-        <w:t>.parametrize</w:t>
+      <w:r>
+        <w:rPr>
+          <w:rFonts w:ascii="Times New Roman" w:hAnsi="Times New Roman" w:cs="Times New Roman"/>
+        </w:rPr>
+        <w:t>pytest.mark.parametrize</w:t>
       </w:r>
       <w:proofErr w:type="spellEnd"/>
       <w:r>
@@ -5656,7 +5495,6 @@
           <w:szCs w:val="32"/>
           <w:u w:val="single"/>
         </w:rPr>
-        <w:lastRenderedPageBreak/>
         <w:t>Future Expansion</w:t>
       </w:r>
     </w:p>
@@ -5939,6 +5777,7 @@
         <w:rPr>
           <w:rFonts w:ascii="Times New Roman" w:hAnsi="Times New Roman" w:cs="Times New Roman"/>
         </w:rPr>
+        <w:lastRenderedPageBreak/>
         <w:t>If the test script is expanded by adding a new section, a new function named “</w:t>
       </w:r>
       <w:proofErr w:type="spellStart"/>
@@ -6009,14 +5848,7 @@
         <w:rPr>
           <w:rFonts w:ascii="Times New Roman" w:hAnsi="Times New Roman" w:cs="Times New Roman"/>
         </w:rPr>
-        <w:t xml:space="preserve">. PySide6 documentation </w:t>
-      </w:r>
-      <w:r>
-        <w:rPr>
-          <w:rFonts w:ascii="Times New Roman" w:hAnsi="Times New Roman" w:cs="Times New Roman"/>
-        </w:rPr>
-        <w:lastRenderedPageBreak/>
-        <w:t xml:space="preserve">recommends using the worker approach, where a </w:t>
+        <w:t xml:space="preserve">. PySide6 documentation recommends using the worker approach, where a </w:t>
       </w:r>
       <w:proofErr w:type="spellStart"/>
       <w:r>
@@ -6107,21 +5939,7 @@
         <w:rPr>
           <w:rFonts w:ascii="Times New Roman" w:hAnsi="Times New Roman" w:cs="Times New Roman"/>
         </w:rPr>
-        <w:t xml:space="preserve"> to manage all serial </w:t>
-      </w:r>
-      <w:proofErr w:type="gramStart"/>
-      <w:r>
-        <w:rPr>
-          <w:rFonts w:ascii="Times New Roman" w:hAnsi="Times New Roman" w:cs="Times New Roman"/>
-        </w:rPr>
-        <w:t>communication, and</w:t>
-      </w:r>
-      <w:proofErr w:type="gramEnd"/>
-      <w:r>
-        <w:rPr>
-          <w:rFonts w:ascii="Times New Roman" w:hAnsi="Times New Roman" w:cs="Times New Roman"/>
-        </w:rPr>
-        <w:t xml:space="preserve"> declare a </w:t>
+        <w:t xml:space="preserve"> to manage all serial communication, and declare a </w:t>
       </w:r>
       <w:proofErr w:type="spellStart"/>
       <w:r>
@@ -7883,6 +7701,14 @@
 </file>
 
 <file path=customXml/item1.xml><?xml version="1.0" encoding="utf-8"?>
+<p:properties xmlns:p="http://schemas.microsoft.com/office/2006/metadata/properties" xmlns:xsi="http://www.w3.org/2001/XMLSchema-instance" xmlns:pc="http://schemas.microsoft.com/office/infopath/2007/PartnerControls">
+  <documentManagement>
+    <_activity xmlns="90d77c43-296a-4b3f-9e49-e5a41fa612db" xsi:nil="true"/>
+  </documentManagement>
+</p:properties>
+</file>
+
+<file path=customXml/item2.xml><?xml version="1.0" encoding="utf-8"?>
 <ct:contentTypeSchema xmlns:ct="http://schemas.microsoft.com/office/2006/metadata/contentType" xmlns:ma="http://schemas.microsoft.com/office/2006/metadata/properties/metaAttributes" ct:_="" ma:_="" ma:contentTypeName="Document" ma:contentTypeID="0x010100E3213E7FCD12C842BD6D52020923FEE7" ma:contentTypeVersion="15" ma:contentTypeDescription="Create a new document." ma:contentTypeScope="" ma:versionID="6d3b405af1beb79a866757960a22950a">
   <xsd:schema xmlns:xsd="http://www.w3.org/2001/XMLSchema" xmlns:xs="http://www.w3.org/2001/XMLSchema" xmlns:p="http://schemas.microsoft.com/office/2006/metadata/properties" xmlns:ns3="90d77c43-296a-4b3f-9e49-e5a41fa612db" xmlns:ns4="e753585f-8e3a-40e2-9fca-7f6a4bd74cca" targetNamespace="http://schemas.microsoft.com/office/2006/metadata/properties" ma:root="true" ma:fieldsID="becdc901ebd396f3014e96f51bd0d99a" ns3:_="" ns4:_="">
     <xsd:import namespace="90d77c43-296a-4b3f-9e49-e5a41fa612db"/>
@@ -8115,14 +7941,6 @@
 </ct:contentTypeSchema>
 </file>
 
-<file path=customXml/item2.xml><?xml version="1.0" encoding="utf-8"?>
-<p:properties xmlns:p="http://schemas.microsoft.com/office/2006/metadata/properties" xmlns:xsi="http://www.w3.org/2001/XMLSchema-instance" xmlns:pc="http://schemas.microsoft.com/office/infopath/2007/PartnerControls">
-  <documentManagement>
-    <_activity xmlns="90d77c43-296a-4b3f-9e49-e5a41fa612db" xsi:nil="true"/>
-  </documentManagement>
-</p:properties>
-</file>
-
 <file path=customXml/item3.xml><?xml version="1.0" encoding="utf-8"?>
 <?mso-contentType ?>
 <FormTemplates xmlns="http://schemas.microsoft.com/sharepoint/v3/contenttype/forms">
@@ -8133,6 +7951,16 @@
 </file>
 
 <file path=customXml/itemProps1.xml><?xml version="1.0" encoding="utf-8"?>
+<ds:datastoreItem xmlns:ds="http://schemas.openxmlformats.org/officeDocument/2006/customXml" ds:itemID="{705B0F98-4BED-42C6-BA5B-C0EA65C9A013}">
+  <ds:schemaRefs>
+    <ds:schemaRef ds:uri="http://schemas.microsoft.com/office/2006/metadata/properties"/>
+    <ds:schemaRef ds:uri="http://schemas.microsoft.com/office/infopath/2007/PartnerControls"/>
+    <ds:schemaRef ds:uri="90d77c43-296a-4b3f-9e49-e5a41fa612db"/>
+  </ds:schemaRefs>
+</ds:datastoreItem>
+</file>
+
+<file path=customXml/itemProps2.xml><?xml version="1.0" encoding="utf-8"?>
 <ds:datastoreItem xmlns:ds="http://schemas.openxmlformats.org/officeDocument/2006/customXml" ds:itemID="{827888A1-2862-4278-B896-5F4D5930CACC}">
   <ds:schemaRefs>
     <ds:schemaRef ds:uri="http://schemas.microsoft.com/office/2006/metadata/contentType"/>
@@ -8151,16 +7979,6 @@
 </ds:datastoreItem>
 </file>
 
-<file path=customXml/itemProps2.xml><?xml version="1.0" encoding="utf-8"?>
-<ds:datastoreItem xmlns:ds="http://schemas.openxmlformats.org/officeDocument/2006/customXml" ds:itemID="{705B0F98-4BED-42C6-BA5B-C0EA65C9A013}">
-  <ds:schemaRefs>
-    <ds:schemaRef ds:uri="http://schemas.microsoft.com/office/2006/metadata/properties"/>
-    <ds:schemaRef ds:uri="http://schemas.microsoft.com/office/infopath/2007/PartnerControls"/>
-    <ds:schemaRef ds:uri="90d77c43-296a-4b3f-9e49-e5a41fa612db"/>
-  </ds:schemaRefs>
-</ds:datastoreItem>
-</file>
-
 <file path=customXml/itemProps3.xml><?xml version="1.0" encoding="utf-8"?>
 <ds:datastoreItem xmlns:ds="http://schemas.openxmlformats.org/officeDocument/2006/customXml" ds:itemID="{375D1BB5-FF7A-4425-A331-134E7D149F6D}">
   <ds:schemaRefs>

</xml_diff>